<commit_message>
Add compiled weekly record PDFs and update experiment reports for weeks 1-4
</commit_message>
<xml_diff>
--- a/Record/week-3-record/Record_Exp03_JS_Basics.docx
+++ b/Record/week-3-record/Record_Exp03_JS_Basics.docx
@@ -4,53 +4,364 @@
   <w:body>
     <w:p>
       <w:pPr>
+        <w:spacing w:after="40"/>
         <w:jc w:val="center"/>
       </w:pPr>
       <w:r>
         <w:rPr>
+          <w:rFonts w:ascii="Calibri" w:hAnsi="Calibri"/>
           <w:b/>
+          <w:color w:val="000000"/>
+          <w:sz w:val="28"/>
         </w:rPr>
         <w:t>DEPARTMENT OF COMPUTER SCIENCE &amp; ENGINEERING</w:t>
-      </w:r>
-      <w:r>
-        <w:rPr>
-          <w:b/>
-        </w:rPr>
-        <w:br/>
-        <w:t>LABORATORY OBSERVATION &amp; RECORD</w:t>
       </w:r>
     </w:p>
     <w:p>
       <w:pPr>
-        <w:spacing w:after="240"/>
+        <w:spacing w:after="280"/>
+        <w:jc w:val="center"/>
       </w:pPr>
       <w:r>
-        <w:t>Course Name: Full Stack Web Development</w:t>
+        <w:rPr>
+          <w:rFonts w:ascii="Calibri" w:hAnsi="Calibri"/>
+          <w:b/>
+          <w:color w:val="000000"/>
+          <w:sz w:val="24"/>
+        </w:rPr>
+        <w:t>LABORATORY OBSERVATION &amp; RECORD</w:t>
       </w:r>
-      <w:r>
-        <w:br/>
-        <w:t>Course Code: 23CM4121</w:t>
-      </w:r>
-      <w:r>
-        <w:br/>
-        <w:t>Experiment No: 03</w:t>
-      </w:r>
-      <w:r>
-        <w:br/>
-        <w:t>Student Name: Patnana Harsha Vardhan</w:t>
-      </w:r>
-      <w:r>
-        <w:br/>
-        <w:t>Roll No: A24126552103</w:t>
-      </w:r>
-      <w:r>
-        <w:br/>
-        <w:t>Branch &amp; Section: CSM-B</w:t>
-      </w:r>
-      <w:r>
-        <w:br/>
-        <w:t>Date of Execution: 08/09/2026</w:t>
-      </w:r>
+    </w:p>
+    <w:tbl>
+      <w:tblPr>
+        <w:tblW w:w="0" w:type="auto"/>
+        <w:jc w:val="center"/>
+        <w:tblLook w:val="04A0" w:firstRow="1" w:lastRow="0" w:firstColumn="1" w:lastColumn="0" w:noHBand="0" w:noVBand="1"/>
+      </w:tblPr>
+      <w:tblGrid>
+        <w:gridCol w:w="4867"/>
+        <w:gridCol w:w="4867"/>
+      </w:tblGrid>
+      <w:tr>
+        <w:trPr>
+          <w:jc w:val="center"/>
+        </w:trPr>
+        <w:tc>
+          <w:tcPr>
+            <w:tcW w:w="4867" w:type="dxa"/>
+            <w:tcBorders>
+              <w:top w:val="single" w:sz="4" w:space="0" w:color="000000"/>
+              <w:left w:val="single" w:sz="4" w:space="0" w:color="000000"/>
+              <w:bottom w:val="single" w:sz="4" w:space="0" w:color="000000"/>
+              <w:right w:val="single" w:sz="4" w:space="0" w:color="000000"/>
+            </w:tcBorders>
+            <w:tcMar>
+              <w:top w:w="80" w:type="dxa"/>
+              <w:left w:w="120" w:type="dxa"/>
+              <w:bottom w:w="80" w:type="dxa"/>
+              <w:right w:w="120" w:type="dxa"/>
+            </w:tcMar>
+          </w:tcPr>
+          <w:p>
+            <w:pPr>
+              <w:spacing w:before="60" w:after="60"/>
+            </w:pPr>
+            <w:r>
+              <w:rPr>
+                <w:rFonts w:ascii="Calibri" w:hAnsi="Calibri"/>
+                <w:b/>
+                <w:color w:val="000000"/>
+                <w:sz w:val="21"/>
+              </w:rPr>
+              <w:t>Course Name:</w:t>
+            </w:r>
+            <w:r>
+              <w:rPr>
+                <w:rFonts w:ascii="Calibri" w:hAnsi="Calibri"/>
+                <w:color w:val="000000"/>
+                <w:sz w:val="21"/>
+              </w:rPr>
+              <w:t xml:space="preserve"> Full Stack Web Development</w:t>
+            </w:r>
+          </w:p>
+        </w:tc>
+        <w:tc>
+          <w:tcPr>
+            <w:tcW w:w="4867" w:type="dxa"/>
+            <w:tcBorders>
+              <w:top w:val="single" w:sz="4" w:space="0" w:color="000000"/>
+              <w:left w:val="single" w:sz="4" w:space="0" w:color="000000"/>
+              <w:bottom w:val="single" w:sz="4" w:space="0" w:color="000000"/>
+              <w:right w:val="single" w:sz="4" w:space="0" w:color="000000"/>
+            </w:tcBorders>
+            <w:tcMar>
+              <w:top w:w="80" w:type="dxa"/>
+              <w:left w:w="120" w:type="dxa"/>
+              <w:bottom w:w="80" w:type="dxa"/>
+              <w:right w:w="120" w:type="dxa"/>
+            </w:tcMar>
+          </w:tcPr>
+          <w:p>
+            <w:pPr>
+              <w:spacing w:before="60" w:after="60"/>
+            </w:pPr>
+            <w:r>
+              <w:rPr>
+                <w:rFonts w:ascii="Calibri" w:hAnsi="Calibri"/>
+                <w:b/>
+                <w:color w:val="000000"/>
+                <w:sz w:val="21"/>
+              </w:rPr>
+              <w:t>Course Code:</w:t>
+            </w:r>
+            <w:r>
+              <w:rPr>
+                <w:rFonts w:ascii="Calibri" w:hAnsi="Calibri"/>
+                <w:color w:val="000000"/>
+                <w:sz w:val="21"/>
+              </w:rPr>
+              <w:t xml:space="preserve"> 23CM4121</w:t>
+            </w:r>
+          </w:p>
+        </w:tc>
+      </w:tr>
+      <w:tr>
+        <w:trPr>
+          <w:jc w:val="center"/>
+        </w:trPr>
+        <w:tc>
+          <w:tcPr>
+            <w:tcW w:w="4867" w:type="dxa"/>
+            <w:tcBorders>
+              <w:top w:val="single" w:sz="4" w:space="0" w:color="000000"/>
+              <w:left w:val="single" w:sz="4" w:space="0" w:color="000000"/>
+              <w:bottom w:val="single" w:sz="4" w:space="0" w:color="000000"/>
+              <w:right w:val="single" w:sz="4" w:space="0" w:color="000000"/>
+            </w:tcBorders>
+            <w:tcMar>
+              <w:top w:w="80" w:type="dxa"/>
+              <w:left w:w="120" w:type="dxa"/>
+              <w:bottom w:w="80" w:type="dxa"/>
+              <w:right w:w="120" w:type="dxa"/>
+            </w:tcMar>
+          </w:tcPr>
+          <w:p>
+            <w:pPr>
+              <w:spacing w:before="60" w:after="60"/>
+            </w:pPr>
+            <w:r>
+              <w:rPr>
+                <w:rFonts w:ascii="Calibri" w:hAnsi="Calibri"/>
+                <w:b/>
+                <w:color w:val="000000"/>
+                <w:sz w:val="21"/>
+              </w:rPr>
+              <w:t>Experiment No:</w:t>
+            </w:r>
+            <w:r>
+              <w:rPr>
+                <w:rFonts w:ascii="Calibri" w:hAnsi="Calibri"/>
+                <w:color w:val="000000"/>
+                <w:sz w:val="21"/>
+              </w:rPr>
+              <w:t xml:space="preserve"> 03</w:t>
+            </w:r>
+          </w:p>
+        </w:tc>
+        <w:tc>
+          <w:tcPr>
+            <w:tcW w:w="4867" w:type="dxa"/>
+            <w:tcBorders>
+              <w:top w:val="single" w:sz="4" w:space="0" w:color="000000"/>
+              <w:left w:val="single" w:sz="4" w:space="0" w:color="000000"/>
+              <w:bottom w:val="single" w:sz="4" w:space="0" w:color="000000"/>
+              <w:right w:val="single" w:sz="4" w:space="0" w:color="000000"/>
+            </w:tcBorders>
+            <w:tcMar>
+              <w:top w:w="80" w:type="dxa"/>
+              <w:left w:w="120" w:type="dxa"/>
+              <w:bottom w:w="80" w:type="dxa"/>
+              <w:right w:w="120" w:type="dxa"/>
+            </w:tcMar>
+          </w:tcPr>
+          <w:p>
+            <w:pPr>
+              <w:spacing w:before="60" w:after="60"/>
+            </w:pPr>
+            <w:r>
+              <w:rPr>
+                <w:rFonts w:ascii="Calibri" w:hAnsi="Calibri"/>
+                <w:b/>
+                <w:color w:val="000000"/>
+                <w:sz w:val="21"/>
+              </w:rPr>
+              <w:t>Date of Execution:</w:t>
+            </w:r>
+            <w:r>
+              <w:rPr>
+                <w:rFonts w:ascii="Calibri" w:hAnsi="Calibri"/>
+                <w:color w:val="000000"/>
+                <w:sz w:val="21"/>
+              </w:rPr>
+              <w:t xml:space="preserve"> </w:t>
+            </w:r>
+          </w:p>
+        </w:tc>
+      </w:tr>
+      <w:tr>
+        <w:trPr>
+          <w:jc w:val="center"/>
+        </w:trPr>
+        <w:tc>
+          <w:tcPr>
+            <w:tcW w:w="4867" w:type="dxa"/>
+            <w:tcBorders>
+              <w:top w:val="single" w:sz="4" w:space="0" w:color="000000"/>
+              <w:left w:val="single" w:sz="4" w:space="0" w:color="000000"/>
+              <w:bottom w:val="single" w:sz="4" w:space="0" w:color="000000"/>
+              <w:right w:val="single" w:sz="4" w:space="0" w:color="000000"/>
+            </w:tcBorders>
+            <w:tcMar>
+              <w:top w:w="80" w:type="dxa"/>
+              <w:left w:w="120" w:type="dxa"/>
+              <w:bottom w:w="80" w:type="dxa"/>
+              <w:right w:w="120" w:type="dxa"/>
+            </w:tcMar>
+          </w:tcPr>
+          <w:p>
+            <w:pPr>
+              <w:spacing w:before="60" w:after="60"/>
+            </w:pPr>
+            <w:r>
+              <w:rPr>
+                <w:rFonts w:ascii="Calibri" w:hAnsi="Calibri"/>
+                <w:b/>
+                <w:color w:val="000000"/>
+                <w:sz w:val="21"/>
+              </w:rPr>
+              <w:t>Student Name:</w:t>
+            </w:r>
+            <w:r>
+              <w:rPr>
+                <w:rFonts w:ascii="Calibri" w:hAnsi="Calibri"/>
+                <w:color w:val="000000"/>
+                <w:sz w:val="21"/>
+              </w:rPr>
+              <w:t xml:space="preserve"> P. Harsha Vardhan</w:t>
+            </w:r>
+          </w:p>
+        </w:tc>
+        <w:tc>
+          <w:tcPr>
+            <w:tcW w:w="4867" w:type="dxa"/>
+            <w:tcBorders>
+              <w:top w:val="single" w:sz="4" w:space="0" w:color="000000"/>
+              <w:left w:val="single" w:sz="4" w:space="0" w:color="000000"/>
+              <w:bottom w:val="single" w:sz="4" w:space="0" w:color="000000"/>
+              <w:right w:val="single" w:sz="4" w:space="0" w:color="000000"/>
+            </w:tcBorders>
+            <w:tcMar>
+              <w:top w:w="80" w:type="dxa"/>
+              <w:left w:w="120" w:type="dxa"/>
+              <w:bottom w:w="80" w:type="dxa"/>
+              <w:right w:w="120" w:type="dxa"/>
+            </w:tcMar>
+          </w:tcPr>
+          <w:p>
+            <w:pPr>
+              <w:spacing w:before="60" w:after="60"/>
+            </w:pPr>
+            <w:r>
+              <w:rPr>
+                <w:rFonts w:ascii="Calibri" w:hAnsi="Calibri"/>
+                <w:b/>
+                <w:color w:val="000000"/>
+                <w:sz w:val="21"/>
+              </w:rPr>
+              <w:t>Roll No:</w:t>
+            </w:r>
+            <w:r>
+              <w:rPr>
+                <w:rFonts w:ascii="Calibri" w:hAnsi="Calibri"/>
+                <w:color w:val="000000"/>
+                <w:sz w:val="21"/>
+              </w:rPr>
+              <w:t xml:space="preserve"> A24126552103</w:t>
+            </w:r>
+          </w:p>
+        </w:tc>
+      </w:tr>
+      <w:tr>
+        <w:trPr>
+          <w:jc w:val="center"/>
+        </w:trPr>
+        <w:tc>
+          <w:tcPr>
+            <w:tcW w:w="4867" w:type="dxa"/>
+            <w:tcBorders>
+              <w:top w:val="single" w:sz="4" w:space="0" w:color="000000"/>
+              <w:left w:val="single" w:sz="4" w:space="0" w:color="000000"/>
+              <w:bottom w:val="single" w:sz="4" w:space="0" w:color="000000"/>
+              <w:right w:val="single" w:sz="4" w:space="0" w:color="000000"/>
+            </w:tcBorders>
+            <w:tcMar>
+              <w:top w:w="80" w:type="dxa"/>
+              <w:left w:w="120" w:type="dxa"/>
+              <w:bottom w:w="80" w:type="dxa"/>
+              <w:right w:w="120" w:type="dxa"/>
+            </w:tcMar>
+          </w:tcPr>
+          <w:p>
+            <w:pPr>
+              <w:spacing w:before="60" w:after="60"/>
+            </w:pPr>
+            <w:r>
+              <w:rPr>
+                <w:rFonts w:ascii="Calibri" w:hAnsi="Calibri"/>
+                <w:b/>
+                <w:color w:val="000000"/>
+                <w:sz w:val="21"/>
+              </w:rPr>
+              <w:t>Branch &amp; Section:</w:t>
+            </w:r>
+            <w:r>
+              <w:rPr>
+                <w:rFonts w:ascii="Calibri" w:hAnsi="Calibri"/>
+                <w:color w:val="000000"/>
+                <w:sz w:val="21"/>
+              </w:rPr>
+              <w:t xml:space="preserve"> CSM-B</w:t>
+            </w:r>
+          </w:p>
+        </w:tc>
+        <w:tc>
+          <w:tcPr>
+            <w:tcW w:w="4867" w:type="dxa"/>
+            <w:tcBorders>
+              <w:top w:val="single" w:sz="4" w:space="0" w:color="000000"/>
+              <w:left w:val="single" w:sz="4" w:space="0" w:color="000000"/>
+              <w:bottom w:val="single" w:sz="4" w:space="0" w:color="000000"/>
+              <w:right w:val="single" w:sz="4" w:space="0" w:color="000000"/>
+            </w:tcBorders>
+            <w:tcMar>
+              <w:top w:w="80" w:type="dxa"/>
+              <w:left w:w="120" w:type="dxa"/>
+              <w:bottom w:w="80" w:type="dxa"/>
+              <w:right w:w="120" w:type="dxa"/>
+            </w:tcMar>
+          </w:tcPr>
+          <w:p>
+            <w:pPr>
+              <w:spacing w:before="60" w:after="60"/>
+            </w:pPr>
+          </w:p>
+        </w:tc>
+      </w:tr>
+    </w:tbl>
+    <w:p>
+      <w:pPr>
+        <w:spacing w:after="120"/>
+      </w:pPr>
     </w:p>
     <w:p>
       <w:pPr>
@@ -59,13 +370,23 @@
       </w:pPr>
       <w:r>
         <w:rPr>
+          <w:rFonts w:ascii="Calibri" w:hAnsi="Calibri"/>
           <w:b/>
+          <w:color w:val="000000"/>
+          <w:sz w:val="24"/>
         </w:rPr>
         <w:t>1. TITLE</w:t>
       </w:r>
     </w:p>
     <w:p>
+      <w:pPr>
+        <w:spacing w:after="120"/>
+      </w:pPr>
       <w:r>
+        <w:rPr>
+          <w:rFonts w:ascii="Calibri" w:hAnsi="Calibri"/>
+          <w:color w:val="000000"/>
+        </w:rPr>
         <w:t>JS Basics - Arrays &amp; Functions</w:t>
       </w:r>
     </w:p>
@@ -76,13 +397,23 @@
       </w:pPr>
       <w:r>
         <w:rPr>
+          <w:rFonts w:ascii="Calibri" w:hAnsi="Calibri"/>
           <w:b/>
+          <w:color w:val="000000"/>
+          <w:sz w:val="24"/>
         </w:rPr>
         <w:t>2. AIM</w:t>
       </w:r>
     </w:p>
     <w:p>
+      <w:pPr>
+        <w:spacing w:after="120"/>
+      </w:pPr>
       <w:r>
+        <w:rPr>
+          <w:rFonts w:ascii="Calibri" w:hAnsi="Calibri"/>
+          <w:color w:val="000000"/>
+        </w:rPr>
         <w:t>To design and implement a JavaScript program demonstrating fundamental array operations, custom utility functions, and array iteration methods to process and manipulate dataset elements dynamically.</w:t>
       </w:r>
     </w:p>
@@ -93,25 +424,51 @@
       </w:pPr>
       <w:r>
         <w:rPr>
+          <w:rFonts w:ascii="Calibri" w:hAnsi="Calibri"/>
           <w:b/>
+          <w:color w:val="000000"/>
+          <w:sz w:val="24"/>
         </w:rPr>
         <w:t>3. OBJECTIVE</w:t>
       </w:r>
     </w:p>
     <w:p>
       <w:pPr>
+        <w:pStyle w:val="ListBullet"/>
         <w:spacing w:after="60"/>
       </w:pPr>
       <w:r>
-        <w:t>• To understand JavaScript function declarations, expressions, and arrow function syntax.</w:t>
+        <w:rPr>
+          <w:rFonts w:ascii="Calibri" w:hAnsi="Calibri"/>
+          <w:color w:val="000000"/>
+        </w:rPr>
+        <w:t>To understand JavaScript function declarations, expressions, and arrow function syntax.</w:t>
       </w:r>
+    </w:p>
+    <w:p>
+      <w:pPr>
+        <w:pStyle w:val="ListBullet"/>
+        <w:spacing w:after="60"/>
+      </w:pPr>
       <w:r>
-        <w:br/>
-        <w:t>• To learn array creation, traversal, and manipulation using built-in array methods.</w:t>
+        <w:rPr>
+          <w:rFonts w:ascii="Calibri" w:hAnsi="Calibri"/>
+          <w:color w:val="000000"/>
+        </w:rPr>
+        <w:t>To learn array creation, traversal, and manipulation using built-in array methods.</w:t>
       </w:r>
+    </w:p>
+    <w:p>
+      <w:pPr>
+        <w:pStyle w:val="ListBullet"/>
+        <w:spacing w:after="60"/>
+      </w:pPr>
       <w:r>
-        <w:br/>
-        <w:t>• To perform dynamic data transformations and calculations using functional programming concepts in JavaScript.</w:t>
+        <w:rPr>
+          <w:rFonts w:ascii="Calibri" w:hAnsi="Calibri"/>
+          <w:color w:val="000000"/>
+        </w:rPr>
+        <w:t>To perform dynamic data transformations and calculations using functional programming concepts in JavaScript.</w:t>
       </w:r>
     </w:p>
     <w:p>
@@ -121,14 +478,88 @@
       </w:pPr>
       <w:r>
         <w:rPr>
+          <w:rFonts w:ascii="Calibri" w:hAnsi="Calibri"/>
           <w:b/>
+          <w:color w:val="000000"/>
+          <w:sz w:val="24"/>
         </w:rPr>
         <w:t>4. THEORY</w:t>
       </w:r>
     </w:p>
     <w:p>
+      <w:pPr>
+        <w:spacing w:after="120"/>
+      </w:pPr>
       <w:r>
-        <w:t>JavaScript arrays are ordered collections of values capable of holding heterogeneous data types. Functions in JavaScript are first-class objects that can be assigned to variables, passed as arguments, and returned from other functions. Built-in array iteration higher-order functions such as forEach(), map(), filter(), and reduce() allow developers to write clean, declarative logic for processing collection data without writing manual index-based loops.</w:t>
+        <w:rPr>
+          <w:rFonts w:ascii="Calibri" w:hAnsi="Calibri"/>
+          <w:color w:val="000000"/>
+        </w:rPr>
+        <w:t xml:space="preserve">JavaScript arrays are ordered collections of values capable of holding heterogeneous data types. Functions in JavaScript are first-class objects that can be assigned to variables, passed as arguments, and returned from other functions. Built-in array iteration higher-order functions such as </w:t>
+      </w:r>
+      <w:proofErr w:type="gramStart"/>
+      <w:r>
+        <w:rPr>
+          <w:rFonts w:ascii="Calibri" w:hAnsi="Calibri"/>
+          <w:color w:val="000000"/>
+        </w:rPr>
+        <w:t>forEach(</w:t>
+      </w:r>
+      <w:proofErr w:type="gramEnd"/>
+      <w:r>
+        <w:rPr>
+          <w:rFonts w:ascii="Calibri" w:hAnsi="Calibri"/>
+          <w:color w:val="000000"/>
+        </w:rPr>
+        <w:t xml:space="preserve">), </w:t>
+      </w:r>
+      <w:proofErr w:type="gramStart"/>
+      <w:r>
+        <w:rPr>
+          <w:rFonts w:ascii="Calibri" w:hAnsi="Calibri"/>
+          <w:color w:val="000000"/>
+        </w:rPr>
+        <w:t>map(</w:t>
+      </w:r>
+      <w:proofErr w:type="gramEnd"/>
+      <w:r>
+        <w:rPr>
+          <w:rFonts w:ascii="Calibri" w:hAnsi="Calibri"/>
+          <w:color w:val="000000"/>
+        </w:rPr>
+        <w:t xml:space="preserve">), </w:t>
+      </w:r>
+      <w:proofErr w:type="gramStart"/>
+      <w:r>
+        <w:rPr>
+          <w:rFonts w:ascii="Calibri" w:hAnsi="Calibri"/>
+          <w:color w:val="000000"/>
+        </w:rPr>
+        <w:t>filter(</w:t>
+      </w:r>
+      <w:proofErr w:type="gramEnd"/>
+      <w:r>
+        <w:rPr>
+          <w:rFonts w:ascii="Calibri" w:hAnsi="Calibri"/>
+          <w:color w:val="000000"/>
+        </w:rPr>
+        <w:t xml:space="preserve">), and </w:t>
+      </w:r>
+      <w:proofErr w:type="gramStart"/>
+      <w:r>
+        <w:rPr>
+          <w:rFonts w:ascii="Calibri" w:hAnsi="Calibri"/>
+          <w:color w:val="000000"/>
+        </w:rPr>
+        <w:t>reduce(</w:t>
+      </w:r>
+      <w:proofErr w:type="gramEnd"/>
+      <w:r>
+        <w:rPr>
+          <w:rFonts w:ascii="Calibri" w:hAnsi="Calibri"/>
+          <w:color w:val="000000"/>
+        </w:rPr>
+        <w:t>) allow developers to write clean, declarative logic for processing collection data without writing manual index-based loops.</w:t>
       </w:r>
     </w:p>
     <w:p>
@@ -138,64 +569,132 @@
       </w:pPr>
       <w:r>
         <w:rPr>
+          <w:rFonts w:ascii="Calibri" w:hAnsi="Calibri"/>
           <w:b/>
+          <w:color w:val="000000"/>
+          <w:sz w:val="24"/>
         </w:rPr>
         <w:t>5. ALGORITHM / PROCEDURE</w:t>
       </w:r>
     </w:p>
     <w:p>
       <w:pPr>
-        <w:spacing w:after="40"/>
-        <w:ind w:left="360"/>
+        <w:spacing w:after="60"/>
       </w:pPr>
       <w:r>
-        <w:t>1. Initialize an HTML5 boilerplate file containing an embedded &lt;script&gt; tag or linked external JavaScript file.</w:t>
+        <w:rPr>
+          <w:rFonts w:ascii="Calibri" w:hAnsi="Calibri"/>
+          <w:b/>
+          <w:color w:val="000000"/>
+        </w:rPr>
+        <w:t xml:space="preserve">1. </w:t>
+      </w:r>
+      <w:r>
+        <w:rPr>
+          <w:rFonts w:ascii="Calibri" w:hAnsi="Calibri"/>
+          <w:color w:val="000000"/>
+        </w:rPr>
+        <w:t>Initialize an HTML5 boilerplate file containing an embedded &lt;script&gt; tag or linked external JavaScript file.</w:t>
       </w:r>
     </w:p>
     <w:p>
       <w:pPr>
-        <w:spacing w:after="40"/>
-        <w:ind w:left="360"/>
+        <w:spacing w:after="60"/>
       </w:pPr>
       <w:r>
-        <w:t>2. Declare a target array containing numerical or string elements.</w:t>
+        <w:rPr>
+          <w:rFonts w:ascii="Calibri" w:hAnsi="Calibri"/>
+          <w:b/>
+          <w:color w:val="000000"/>
+        </w:rPr>
+        <w:t xml:space="preserve">2. </w:t>
+      </w:r>
+      <w:r>
+        <w:rPr>
+          <w:rFonts w:ascii="Calibri" w:hAnsi="Calibri"/>
+          <w:color w:val="000000"/>
+        </w:rPr>
+        <w:t>Declare a target array containing numerical elements.</w:t>
       </w:r>
     </w:p>
     <w:p>
       <w:pPr>
-        <w:spacing w:after="40"/>
-        <w:ind w:left="360"/>
+        <w:spacing w:after="60"/>
       </w:pPr>
       <w:r>
-        <w:t>3. Define custom JavaScript functions to perform operations such as calculating averages, filtering elements based on conditions, and finding minimum/maximum values.</w:t>
+        <w:rPr>
+          <w:rFonts w:ascii="Calibri" w:hAnsi="Calibri"/>
+          <w:b/>
+          <w:color w:val="000000"/>
+        </w:rPr>
+        <w:t xml:space="preserve">3. </w:t>
+      </w:r>
+      <w:r>
+        <w:rPr>
+          <w:rFonts w:ascii="Calibri" w:hAnsi="Calibri"/>
+          <w:color w:val="000000"/>
+        </w:rPr>
+        <w:t>Define custom simplified JavaScript functions (printList, getSum, getAvg, getMax, getMin, containsVal, filterEvens, addVal, removeVal) to perform array processing.</w:t>
       </w:r>
     </w:p>
     <w:p>
       <w:pPr>
-        <w:spacing w:after="40"/>
-        <w:ind w:left="360"/>
+        <w:spacing w:after="60"/>
       </w:pPr>
       <w:r>
-        <w:t>4. Utilize array iteration helper methods (e.g., map(), filter(), reduce()) to transform and extract sub-arrays.</w:t>
+        <w:rPr>
+          <w:rFonts w:ascii="Calibri" w:hAnsi="Calibri"/>
+          <w:b/>
+          <w:color w:val="000000"/>
+        </w:rPr>
+        <w:t xml:space="preserve">4. </w:t>
+      </w:r>
+      <w:r>
+        <w:rPr>
+          <w:rFonts w:ascii="Calibri" w:hAnsi="Calibri"/>
+          <w:color w:val="000000"/>
+        </w:rPr>
+        <w:t>Utilize built-in methods (filter, includes, push, pop, reduce) to perform search and modification operations.</w:t>
       </w:r>
     </w:p>
     <w:p>
       <w:pPr>
-        <w:spacing w:after="40"/>
-        <w:ind w:left="360"/>
+        <w:spacing w:after="60"/>
       </w:pPr>
       <w:r>
-        <w:lastRenderedPageBreak/>
-        <w:t>5. Log input data and calculated output results to the browser console (console.log()) and dynamic DOM elements.</w:t>
+        <w:rPr>
+          <w:rFonts w:ascii="Calibri" w:hAnsi="Calibri"/>
+          <w:b/>
+          <w:color w:val="000000"/>
+        </w:rPr>
+        <w:t xml:space="preserve">5. </w:t>
+      </w:r>
+      <w:r>
+        <w:rPr>
+          <w:rFonts w:ascii="Calibri" w:hAnsi="Calibri"/>
+          <w:color w:val="000000"/>
+        </w:rPr>
+        <w:t>Log input data and calculated output results to the browser developer console.</w:t>
       </w:r>
     </w:p>
     <w:p>
       <w:pPr>
-        <w:spacing w:after="40"/>
-        <w:ind w:left="360"/>
+        <w:spacing w:after="60"/>
       </w:pPr>
       <w:r>
-        <w:t>6. Execute the script in a web browser or Node.js environment, inspecting browser developer tools to verify output.</w:t>
+        <w:rPr>
+          <w:rFonts w:ascii="Calibri" w:hAnsi="Calibri"/>
+          <w:b/>
+          <w:color w:val="000000"/>
+        </w:rPr>
+        <w:t xml:space="preserve">6. </w:t>
+      </w:r>
+      <w:r>
+        <w:rPr>
+          <w:rFonts w:ascii="Calibri" w:hAnsi="Calibri"/>
+          <w:color w:val="000000"/>
+        </w:rPr>
+        <w:t>Execute test cases including standard inputs, edge cases, and empty arrays to observe standard behavior and failure modes.</w:t>
       </w:r>
     </w:p>
     <w:p>
@@ -205,433 +704,1086 @@
       </w:pPr>
       <w:r>
         <w:rPr>
+          <w:rFonts w:ascii="Calibri" w:hAnsi="Calibri"/>
           <w:b/>
+          <w:color w:val="000000"/>
+          <w:sz w:val="24"/>
         </w:rPr>
+        <w:lastRenderedPageBreak/>
         <w:t>6. PROGRAM</w:t>
       </w:r>
     </w:p>
-    <w:p>
-      <w:pPr>
-        <w:spacing w:line="240" w:lineRule="auto"/>
-        <w:ind w:left="288"/>
-      </w:pPr>
-      <w:r>
-        <w:rPr>
-          <w:rFonts w:ascii="Courier New" w:hAnsi="Courier New"/>
-          <w:sz w:val="18"/>
-        </w:rPr>
-        <w:t>&lt;!DOCTYPE html&gt;</w:t>
-      </w:r>
-      <w:r>
-        <w:rPr>
-          <w:rFonts w:ascii="Courier New" w:hAnsi="Courier New"/>
-          <w:sz w:val="18"/>
-        </w:rPr>
-        <w:br/>
-        <w:t>&lt;html lang="en"&gt;</w:t>
-      </w:r>
-      <w:r>
-        <w:rPr>
-          <w:rFonts w:ascii="Courier New" w:hAnsi="Courier New"/>
-          <w:sz w:val="18"/>
-        </w:rPr>
-        <w:br/>
-        <w:t>&lt;head&gt;</w:t>
-      </w:r>
-      <w:r>
-        <w:rPr>
-          <w:rFonts w:ascii="Courier New" w:hAnsi="Courier New"/>
-          <w:sz w:val="18"/>
-        </w:rPr>
-        <w:br/>
-        <w:t xml:space="preserve">    &lt;meta charset="UTF-8"&gt;</w:t>
-      </w:r>
-      <w:r>
-        <w:rPr>
-          <w:rFonts w:ascii="Courier New" w:hAnsi="Courier New"/>
-          <w:sz w:val="18"/>
-        </w:rPr>
-        <w:br/>
-        <w:t xml:space="preserve">    &lt;meta name="viewport" content="width=device-width, initial-scale=1.0"&gt;</w:t>
-      </w:r>
-      <w:r>
-        <w:rPr>
-          <w:rFonts w:ascii="Courier New" w:hAnsi="Courier New"/>
-          <w:sz w:val="18"/>
-        </w:rPr>
-        <w:br/>
-        <w:t xml:space="preserve">    &lt;title&gt;JS Basics - Arrays &amp; Functions&lt;/title&gt;</w:t>
-      </w:r>
-      <w:r>
-        <w:rPr>
-          <w:rFonts w:ascii="Courier New" w:hAnsi="Courier New"/>
-          <w:sz w:val="18"/>
-        </w:rPr>
-        <w:br/>
-        <w:t>&lt;/head&gt;</w:t>
-      </w:r>
-      <w:r>
-        <w:rPr>
-          <w:rFonts w:ascii="Courier New" w:hAnsi="Courier New"/>
-          <w:sz w:val="18"/>
-        </w:rPr>
-        <w:br/>
-        <w:t>&lt;body&gt;</w:t>
-      </w:r>
-      <w:r>
-        <w:rPr>
-          <w:rFonts w:ascii="Courier New" w:hAnsi="Courier New"/>
-          <w:sz w:val="18"/>
-        </w:rPr>
-        <w:br/>
-        <w:t xml:space="preserve">    &lt;h1&gt;JavaScript Arrays &amp; Functions Demonstration&lt;/h1&gt;</w:t>
-      </w:r>
-      <w:r>
-        <w:rPr>
-          <w:rFonts w:ascii="Courier New" w:hAnsi="Courier New"/>
-          <w:sz w:val="18"/>
-        </w:rPr>
-        <w:br/>
-        <w:t xml:space="preserve">    &lt;div id="output"&gt;&lt;/div&gt;</w:t>
-      </w:r>
-      <w:r>
-        <w:rPr>
-          <w:rFonts w:ascii="Courier New" w:hAnsi="Courier New"/>
-          <w:sz w:val="18"/>
-        </w:rPr>
-        <w:br/>
-      </w:r>
-      <w:r>
-        <w:rPr>
-          <w:rFonts w:ascii="Courier New" w:hAnsi="Courier New"/>
-          <w:sz w:val="18"/>
-        </w:rPr>
-        <w:br/>
-        <w:t xml:space="preserve">    &lt;script&gt;</w:t>
-      </w:r>
-      <w:r>
-        <w:rPr>
-          <w:rFonts w:ascii="Courier New" w:hAnsi="Courier New"/>
-          <w:sz w:val="18"/>
-        </w:rPr>
-        <w:br/>
-        <w:t xml:space="preserve">        // Array Initialization</w:t>
-      </w:r>
-      <w:r>
-        <w:rPr>
-          <w:rFonts w:ascii="Courier New" w:hAnsi="Courier New"/>
-          <w:sz w:val="18"/>
-        </w:rPr>
-        <w:br/>
-        <w:t xml:space="preserve">        const marks = [85, 92, 78, 64, 95, 88];</w:t>
-      </w:r>
-      <w:r>
-        <w:rPr>
-          <w:rFonts w:ascii="Courier New" w:hAnsi="Courier New"/>
-          <w:sz w:val="18"/>
-        </w:rPr>
-        <w:br/>
-      </w:r>
-      <w:r>
-        <w:rPr>
-          <w:rFonts w:ascii="Courier New" w:hAnsi="Courier New"/>
-          <w:sz w:val="18"/>
-        </w:rPr>
-        <w:br/>
-        <w:t xml:space="preserve">        // Function 1: Calculate Average</w:t>
-      </w:r>
-      <w:r>
-        <w:rPr>
-          <w:rFonts w:ascii="Courier New" w:hAnsi="Courier New"/>
-          <w:sz w:val="18"/>
-        </w:rPr>
-        <w:br/>
-        <w:t xml:space="preserve">        function calculateAverage(arr) {</w:t>
-      </w:r>
-      <w:r>
-        <w:rPr>
-          <w:rFonts w:ascii="Courier New" w:hAnsi="Courier New"/>
-          <w:sz w:val="18"/>
-        </w:rPr>
-        <w:br/>
-        <w:t xml:space="preserve">            const sum = arr.reduce((acc, curr) =&gt; acc + curr, 0);</w:t>
-      </w:r>
-      <w:r>
-        <w:rPr>
-          <w:rFonts w:ascii="Courier New" w:hAnsi="Courier New"/>
-          <w:sz w:val="18"/>
-        </w:rPr>
-        <w:br/>
-        <w:t xml:space="preserve">            return (sum / arr.length).toFixed(2);</w:t>
-      </w:r>
-      <w:r>
-        <w:rPr>
-          <w:rFonts w:ascii="Courier New" w:hAnsi="Courier New"/>
-          <w:sz w:val="18"/>
-        </w:rPr>
-        <w:br/>
-        <w:t xml:space="preserve">        }</w:t>
-      </w:r>
-      <w:r>
-        <w:rPr>
-          <w:rFonts w:ascii="Courier New" w:hAnsi="Courier New"/>
-          <w:sz w:val="18"/>
-        </w:rPr>
-        <w:br/>
-      </w:r>
-      <w:r>
-        <w:rPr>
-          <w:rFonts w:ascii="Courier New" w:hAnsi="Courier New"/>
-          <w:sz w:val="18"/>
-        </w:rPr>
-        <w:br/>
-        <w:t xml:space="preserve">        // Function 2: Filter High Scores (Marks &gt;= 80)</w:t>
-      </w:r>
-      <w:r>
-        <w:rPr>
-          <w:rFonts w:ascii="Courier New" w:hAnsi="Courier New"/>
-          <w:sz w:val="18"/>
-        </w:rPr>
-        <w:br/>
-        <w:t xml:space="preserve">        const filterHighScores = (arr) =&gt; arr.filter(score =&gt; score &gt;= 80);</w:t>
-      </w:r>
-      <w:r>
-        <w:rPr>
-          <w:rFonts w:ascii="Courier New" w:hAnsi="Courier New"/>
-          <w:sz w:val="18"/>
-        </w:rPr>
-        <w:br/>
-      </w:r>
-      <w:r>
-        <w:rPr>
-          <w:rFonts w:ascii="Courier New" w:hAnsi="Courier New"/>
-          <w:sz w:val="18"/>
-        </w:rPr>
-        <w:br/>
-        <w:t xml:space="preserve">        // Function 3: Find Max and Min Marks</w:t>
-      </w:r>
-      <w:r>
-        <w:rPr>
-          <w:rFonts w:ascii="Courier New" w:hAnsi="Courier New"/>
-          <w:sz w:val="18"/>
-        </w:rPr>
-        <w:br/>
-        <w:t xml:space="preserve">        function getMinMax(arr) {</w:t>
-      </w:r>
-      <w:r>
-        <w:rPr>
-          <w:rFonts w:ascii="Courier New" w:hAnsi="Courier New"/>
-          <w:sz w:val="18"/>
-        </w:rPr>
-        <w:br/>
-        <w:t xml:space="preserve">            return {</w:t>
-      </w:r>
-      <w:r>
-        <w:rPr>
-          <w:rFonts w:ascii="Courier New" w:hAnsi="Courier New"/>
-          <w:sz w:val="18"/>
-        </w:rPr>
-        <w:br/>
-        <w:t xml:space="preserve">                max: Math.max(...arr),</w:t>
-      </w:r>
-      <w:r>
-        <w:rPr>
-          <w:rFonts w:ascii="Courier New" w:hAnsi="Courier New"/>
-          <w:sz w:val="18"/>
-        </w:rPr>
-        <w:br/>
-        <w:t xml:space="preserve">                min: Math.min(...arr)</w:t>
-      </w:r>
-      <w:r>
-        <w:rPr>
-          <w:rFonts w:ascii="Courier New" w:hAnsi="Courier New"/>
-          <w:sz w:val="18"/>
-        </w:rPr>
-        <w:br/>
-        <w:t xml:space="preserve">            };</w:t>
-      </w:r>
-      <w:r>
-        <w:rPr>
-          <w:rFonts w:ascii="Courier New" w:hAnsi="Courier New"/>
-          <w:sz w:val="18"/>
-        </w:rPr>
-        <w:br/>
-        <w:t xml:space="preserve">        }</w:t>
-      </w:r>
-      <w:r>
-        <w:rPr>
-          <w:rFonts w:ascii="Courier New" w:hAnsi="Courier New"/>
-          <w:sz w:val="18"/>
-        </w:rPr>
-        <w:br/>
-      </w:r>
-      <w:r>
-        <w:rPr>
-          <w:rFonts w:ascii="Courier New" w:hAnsi="Courier New"/>
-          <w:sz w:val="18"/>
-        </w:rPr>
-        <w:br/>
-        <w:t xml:space="preserve">        // Execution &amp; Execution Output Data</w:t>
-      </w:r>
-      <w:r>
-        <w:rPr>
-          <w:rFonts w:ascii="Courier New" w:hAnsi="Courier New"/>
-          <w:sz w:val="18"/>
-        </w:rPr>
-        <w:br/>
-        <w:t xml:space="preserve">        const avg = calculateAverage(marks);</w:t>
-      </w:r>
-      <w:r>
-        <w:rPr>
-          <w:rFonts w:ascii="Courier New" w:hAnsi="Courier New"/>
-          <w:sz w:val="18"/>
-        </w:rPr>
-        <w:br/>
-        <w:t xml:space="preserve">        const topMarks = filterHighScores(marks);</w:t>
-      </w:r>
-      <w:r>
-        <w:rPr>
-          <w:rFonts w:ascii="Courier New" w:hAnsi="Courier New"/>
-          <w:sz w:val="18"/>
-        </w:rPr>
-        <w:br/>
-        <w:t xml:space="preserve">        const { max, min } = getMinMax(marks);</w:t>
-      </w:r>
-      <w:r>
-        <w:rPr>
-          <w:rFonts w:ascii="Courier New" w:hAnsi="Courier New"/>
-          <w:sz w:val="18"/>
-        </w:rPr>
-        <w:br/>
-      </w:r>
-      <w:r>
-        <w:rPr>
-          <w:rFonts w:ascii="Courier New" w:hAnsi="Courier New"/>
-          <w:sz w:val="18"/>
-        </w:rPr>
-        <w:br/>
-        <w:t xml:space="preserve">        // Output to Browser Console</w:t>
-      </w:r>
-      <w:r>
-        <w:rPr>
-          <w:rFonts w:ascii="Courier New" w:hAnsi="Courier New"/>
-          <w:sz w:val="18"/>
-        </w:rPr>
-        <w:br/>
-        <w:t xml:space="preserve">        console.log("Original Marks:", marks);</w:t>
-      </w:r>
-      <w:r>
-        <w:rPr>
-          <w:rFonts w:ascii="Courier New" w:hAnsi="Courier New"/>
-          <w:sz w:val="18"/>
-        </w:rPr>
-        <w:br/>
-        <w:t xml:space="preserve">        console.log("Average Marks:", avg);</w:t>
-      </w:r>
-      <w:r>
-        <w:rPr>
-          <w:rFonts w:ascii="Courier New" w:hAnsi="Courier New"/>
-          <w:sz w:val="18"/>
-        </w:rPr>
-        <w:br/>
-        <w:t xml:space="preserve">        console.log("Top Marks (&gt;= 80):", topMarks);</w:t>
-      </w:r>
-      <w:r>
-        <w:rPr>
-          <w:rFonts w:ascii="Courier New" w:hAnsi="Courier New"/>
-          <w:sz w:val="18"/>
-        </w:rPr>
-        <w:br/>
-        <w:t xml:space="preserve">        console.log(`Highest Mark: ${max}, Lowest Mark: ${min}`);</w:t>
-      </w:r>
-      <w:r>
-        <w:rPr>
-          <w:rFonts w:ascii="Courier New" w:hAnsi="Courier New"/>
-          <w:sz w:val="18"/>
-        </w:rPr>
-        <w:br/>
-      </w:r>
-      <w:r>
-        <w:rPr>
-          <w:rFonts w:ascii="Courier New" w:hAnsi="Courier New"/>
-          <w:sz w:val="18"/>
-        </w:rPr>
-        <w:br/>
-        <w:t xml:space="preserve">        // Output to Web Page</w:t>
-      </w:r>
-      <w:r>
-        <w:rPr>
-          <w:rFonts w:ascii="Courier New" w:hAnsi="Courier New"/>
-          <w:sz w:val="18"/>
-        </w:rPr>
-        <w:br/>
-        <w:t xml:space="preserve">        document.getElementById("output").innerHTML = `</w:t>
-      </w:r>
-      <w:r>
-        <w:rPr>
-          <w:rFonts w:ascii="Courier New" w:hAnsi="Courier New"/>
-          <w:sz w:val="18"/>
-        </w:rPr>
-        <w:br/>
-        <w:t xml:space="preserve">            &lt;p&gt;&lt;strong&gt;Original Marks:&lt;/strong&gt; ${marks.join(", ")}&lt;/p&gt;</w:t>
-      </w:r>
-      <w:r>
-        <w:rPr>
-          <w:rFonts w:ascii="Courier New" w:hAnsi="Courier New"/>
-          <w:sz w:val="18"/>
-        </w:rPr>
-        <w:br/>
-        <w:t xml:space="preserve">            &lt;p&gt;&lt;strong&gt;Average Marks:&lt;/strong&gt; ${avg}&lt;/p&gt;</w:t>
-      </w:r>
-      <w:r>
-        <w:rPr>
-          <w:rFonts w:ascii="Courier New" w:hAnsi="Courier New"/>
-          <w:sz w:val="18"/>
-        </w:rPr>
-        <w:br/>
-        <w:t xml:space="preserve">            &lt;p&gt;&lt;strong&gt;Top Scores (&amp;ge; 80):&lt;/strong&gt; ${topMarks.join(", ")}&lt;/p&gt;</w:t>
-      </w:r>
-      <w:r>
-        <w:rPr>
-          <w:rFonts w:ascii="Courier New" w:hAnsi="Courier New"/>
-          <w:sz w:val="18"/>
-        </w:rPr>
-        <w:br/>
-        <w:t xml:space="preserve">            &lt;p&gt;&lt;strong&gt;Highest:&lt;/strong&gt; ${max} | &lt;strong&gt;Lowest:&lt;/strong&gt; ${min}&lt;/p&gt;</w:t>
-      </w:r>
-      <w:r>
-        <w:rPr>
-          <w:rFonts w:ascii="Courier New" w:hAnsi="Courier New"/>
-          <w:sz w:val="18"/>
-        </w:rPr>
-        <w:br/>
-        <w:t xml:space="preserve">        `;</w:t>
-      </w:r>
-      <w:r>
-        <w:rPr>
-          <w:rFonts w:ascii="Courier New" w:hAnsi="Courier New"/>
-          <w:sz w:val="18"/>
-        </w:rPr>
-        <w:br/>
-        <w:t xml:space="preserve">    &lt;/script&gt;</w:t>
-      </w:r>
-      <w:r>
-        <w:rPr>
-          <w:rFonts w:ascii="Courier New" w:hAnsi="Courier New"/>
-          <w:sz w:val="18"/>
-        </w:rPr>
-        <w:br/>
-        <w:t>&lt;/body&gt;</w:t>
-      </w:r>
-      <w:r>
-        <w:rPr>
-          <w:rFonts w:ascii="Courier New" w:hAnsi="Courier New"/>
-          <w:sz w:val="18"/>
-        </w:rPr>
-        <w:br/>
-        <w:t>&lt;/html&gt;</w:t>
-      </w:r>
-    </w:p>
+    <w:tbl>
+      <w:tblPr>
+        <w:tblW w:w="0" w:type="auto"/>
+        <w:jc w:val="center"/>
+        <w:tblLook w:val="04A0" w:firstRow="1" w:lastRow="0" w:firstColumn="1" w:lastColumn="0" w:noHBand="0" w:noVBand="1"/>
+      </w:tblPr>
+      <w:tblGrid>
+        <w:gridCol w:w="9739"/>
+      </w:tblGrid>
+      <w:tr>
+        <w:trPr>
+          <w:jc w:val="center"/>
+        </w:trPr>
+        <w:tc>
+          <w:tcPr>
+            <w:tcW w:w="9749" w:type="dxa"/>
+            <w:tcBorders>
+              <w:top w:val="single" w:sz="4" w:space="0" w:color="CCCCCC"/>
+              <w:left w:val="single" w:sz="4" w:space="0" w:color="CCCCCC"/>
+              <w:bottom w:val="single" w:sz="4" w:space="0" w:color="CCCCCC"/>
+              <w:right w:val="single" w:sz="4" w:space="0" w:color="CCCCCC"/>
+            </w:tcBorders>
+            <w:shd w:val="clear" w:color="auto" w:fill="F8F8F8"/>
+            <w:tcMar>
+              <w:top w:w="120" w:type="dxa"/>
+              <w:left w:w="180" w:type="dxa"/>
+              <w:bottom w:w="120" w:type="dxa"/>
+              <w:right w:w="180" w:type="dxa"/>
+            </w:tcMar>
+          </w:tcPr>
+          <w:p>
+            <w:pPr>
+              <w:spacing w:after="0"/>
+            </w:pPr>
+            <w:r>
+              <w:rPr>
+                <w:rFonts w:ascii="Consolas" w:hAnsi="Consolas"/>
+                <w:color w:val="141414"/>
+                <w:sz w:val="19"/>
+              </w:rPr>
+              <w:t>function to print array elements</w:t>
+            </w:r>
+            <w:r>
+              <w:rPr>
+                <w:rFonts w:ascii="Consolas" w:hAnsi="Consolas"/>
+                <w:color w:val="141414"/>
+                <w:sz w:val="19"/>
+              </w:rPr>
+              <w:br/>
+              <w:t>function printList(arr) {</w:t>
+            </w:r>
+            <w:r>
+              <w:rPr>
+                <w:rFonts w:ascii="Consolas" w:hAnsi="Consolas"/>
+                <w:color w:val="141414"/>
+                <w:sz w:val="19"/>
+              </w:rPr>
+              <w:br/>
+              <w:t xml:space="preserve">    console.log("Array Content:", arr.join(" "));</w:t>
+            </w:r>
+            <w:r>
+              <w:rPr>
+                <w:rFonts w:ascii="Consolas" w:hAnsi="Consolas"/>
+                <w:color w:val="141414"/>
+                <w:sz w:val="19"/>
+              </w:rPr>
+              <w:br/>
+              <w:t>}</w:t>
+            </w:r>
+            <w:r>
+              <w:rPr>
+                <w:rFonts w:ascii="Consolas" w:hAnsi="Consolas"/>
+                <w:color w:val="141414"/>
+                <w:sz w:val="19"/>
+              </w:rPr>
+              <w:br/>
+              <w:t>// Function to calculate total sum</w:t>
+            </w:r>
+            <w:r>
+              <w:rPr>
+                <w:rFonts w:ascii="Consolas" w:hAnsi="Consolas"/>
+                <w:color w:val="141414"/>
+                <w:sz w:val="19"/>
+              </w:rPr>
+              <w:br/>
+              <w:t xml:space="preserve">function </w:t>
+            </w:r>
+            <w:proofErr w:type="spellStart"/>
+            <w:r>
+              <w:rPr>
+                <w:rFonts w:ascii="Consolas" w:hAnsi="Consolas"/>
+                <w:color w:val="141414"/>
+                <w:sz w:val="19"/>
+              </w:rPr>
+              <w:t>getSum</w:t>
+            </w:r>
+            <w:proofErr w:type="spellEnd"/>
+            <w:r>
+              <w:rPr>
+                <w:rFonts w:ascii="Consolas" w:hAnsi="Consolas"/>
+                <w:color w:val="141414"/>
+                <w:sz w:val="19"/>
+              </w:rPr>
+              <w:t>(</w:t>
+            </w:r>
+            <w:proofErr w:type="spellStart"/>
+            <w:r>
+              <w:rPr>
+                <w:rFonts w:ascii="Consolas" w:hAnsi="Consolas"/>
+                <w:color w:val="141414"/>
+                <w:sz w:val="19"/>
+              </w:rPr>
+              <w:t>arr</w:t>
+            </w:r>
+            <w:proofErr w:type="spellEnd"/>
+            <w:r>
+              <w:rPr>
+                <w:rFonts w:ascii="Consolas" w:hAnsi="Consolas"/>
+                <w:color w:val="141414"/>
+                <w:sz w:val="19"/>
+              </w:rPr>
+              <w:t>) {</w:t>
+            </w:r>
+            <w:r>
+              <w:rPr>
+                <w:rFonts w:ascii="Consolas" w:hAnsi="Consolas"/>
+                <w:color w:val="141414"/>
+                <w:sz w:val="19"/>
+              </w:rPr>
+              <w:br/>
+              <w:t xml:space="preserve">    let sum = 0;</w:t>
+            </w:r>
+            <w:r>
+              <w:rPr>
+                <w:rFonts w:ascii="Consolas" w:hAnsi="Consolas"/>
+                <w:color w:val="141414"/>
+                <w:sz w:val="19"/>
+              </w:rPr>
+              <w:br/>
+              <w:t xml:space="preserve">    for (let i = 0; i &lt; arr.length; i++) {</w:t>
+            </w:r>
+            <w:r>
+              <w:rPr>
+                <w:rFonts w:ascii="Consolas" w:hAnsi="Consolas"/>
+                <w:color w:val="141414"/>
+                <w:sz w:val="19"/>
+              </w:rPr>
+              <w:br/>
+              <w:t xml:space="preserve">        sum += arr[i];</w:t>
+            </w:r>
+            <w:r>
+              <w:rPr>
+                <w:rFonts w:ascii="Consolas" w:hAnsi="Consolas"/>
+                <w:color w:val="141414"/>
+                <w:sz w:val="19"/>
+              </w:rPr>
+              <w:br/>
+              <w:t xml:space="preserve">    }</w:t>
+            </w:r>
+            <w:r>
+              <w:rPr>
+                <w:rFonts w:ascii="Consolas" w:hAnsi="Consolas"/>
+                <w:color w:val="141414"/>
+                <w:sz w:val="19"/>
+              </w:rPr>
+              <w:br/>
+              <w:t xml:space="preserve">    return sum;</w:t>
+            </w:r>
+            <w:r>
+              <w:rPr>
+                <w:rFonts w:ascii="Consolas" w:hAnsi="Consolas"/>
+                <w:color w:val="141414"/>
+                <w:sz w:val="19"/>
+              </w:rPr>
+              <w:br/>
+              <w:t>}</w:t>
+            </w:r>
+            <w:r>
+              <w:rPr>
+                <w:rFonts w:ascii="Consolas" w:hAnsi="Consolas"/>
+                <w:color w:val="141414"/>
+                <w:sz w:val="19"/>
+              </w:rPr>
+              <w:br/>
+            </w:r>
+            <w:r>
+              <w:rPr>
+                <w:rFonts w:ascii="Consolas" w:hAnsi="Consolas"/>
+                <w:color w:val="141414"/>
+                <w:sz w:val="19"/>
+              </w:rPr>
+              <w:t>// Function t average</w:t>
+            </w:r>
+            <w:r>
+              <w:rPr>
+                <w:rFonts w:ascii="Consolas" w:hAnsi="Consolas"/>
+                <w:color w:val="141414"/>
+                <w:sz w:val="19"/>
+              </w:rPr>
+              <w:br/>
+              <w:t>function getAvg(arr) {</w:t>
+            </w:r>
+            <w:r>
+              <w:rPr>
+                <w:rFonts w:ascii="Consolas" w:hAnsi="Consolas"/>
+                <w:color w:val="141414"/>
+                <w:sz w:val="19"/>
+              </w:rPr>
+              <w:br/>
+              <w:t xml:space="preserve">    if (arr.length === 0) return 0;</w:t>
+            </w:r>
+            <w:r>
+              <w:rPr>
+                <w:rFonts w:ascii="Consolas" w:hAnsi="Consolas"/>
+                <w:color w:val="141414"/>
+                <w:sz w:val="19"/>
+              </w:rPr>
+              <w:br/>
+              <w:t xml:space="preserve">    return getSum(arr) / arr.length;</w:t>
+            </w:r>
+            <w:r>
+              <w:rPr>
+                <w:rFonts w:ascii="Consolas" w:hAnsi="Consolas"/>
+                <w:color w:val="141414"/>
+                <w:sz w:val="19"/>
+              </w:rPr>
+              <w:br/>
+              <w:t>}</w:t>
+            </w:r>
+            <w:r>
+              <w:rPr>
+                <w:rFonts w:ascii="Consolas" w:hAnsi="Consolas"/>
+                <w:color w:val="141414"/>
+                <w:sz w:val="19"/>
+              </w:rPr>
+              <w:br/>
+              <w:t>// Function to find maximum</w:t>
+            </w:r>
+            <w:r>
+              <w:rPr>
+                <w:rFonts w:ascii="Consolas" w:hAnsi="Consolas"/>
+                <w:color w:val="141414"/>
+                <w:sz w:val="19"/>
+              </w:rPr>
+              <w:br/>
+              <w:t>function getMax(arr) {</w:t>
+            </w:r>
+            <w:r>
+              <w:rPr>
+                <w:rFonts w:ascii="Consolas" w:hAnsi="Consolas"/>
+                <w:color w:val="141414"/>
+                <w:sz w:val="19"/>
+              </w:rPr>
+              <w:br/>
+              <w:t xml:space="preserve">    if (arr.length === 0) return undefined;</w:t>
+            </w:r>
+            <w:r>
+              <w:rPr>
+                <w:rFonts w:ascii="Consolas" w:hAnsi="Consolas"/>
+                <w:color w:val="141414"/>
+                <w:sz w:val="19"/>
+              </w:rPr>
+              <w:br/>
+              <w:t xml:space="preserve">    let max = arr[0];</w:t>
+            </w:r>
+            <w:r>
+              <w:rPr>
+                <w:rFonts w:ascii="Consolas" w:hAnsi="Consolas"/>
+                <w:color w:val="141414"/>
+                <w:sz w:val="19"/>
+              </w:rPr>
+              <w:br/>
+              <w:t xml:space="preserve">    for (let i = 1; i &lt; arr.length; i++) {</w:t>
+            </w:r>
+            <w:r>
+              <w:rPr>
+                <w:rFonts w:ascii="Consolas" w:hAnsi="Consolas"/>
+                <w:color w:val="141414"/>
+                <w:sz w:val="19"/>
+              </w:rPr>
+              <w:br/>
+              <w:t xml:space="preserve">        if (arr[i] &gt; max) max = arr[i];</w:t>
+            </w:r>
+            <w:r>
+              <w:rPr>
+                <w:rFonts w:ascii="Consolas" w:hAnsi="Consolas"/>
+                <w:color w:val="141414"/>
+                <w:sz w:val="19"/>
+              </w:rPr>
+              <w:br/>
+              <w:t xml:space="preserve">    }</w:t>
+            </w:r>
+            <w:r>
+              <w:rPr>
+                <w:rFonts w:ascii="Consolas" w:hAnsi="Consolas"/>
+                <w:color w:val="141414"/>
+                <w:sz w:val="19"/>
+              </w:rPr>
+              <w:br/>
+              <w:t xml:space="preserve">    return max;</w:t>
+            </w:r>
+            <w:r>
+              <w:rPr>
+                <w:rFonts w:ascii="Consolas" w:hAnsi="Consolas"/>
+                <w:color w:val="141414"/>
+                <w:sz w:val="19"/>
+              </w:rPr>
+              <w:br/>
+              <w:t>}</w:t>
+            </w:r>
+            <w:r>
+              <w:rPr>
+                <w:rFonts w:ascii="Consolas" w:hAnsi="Consolas"/>
+                <w:color w:val="141414"/>
+                <w:sz w:val="19"/>
+              </w:rPr>
+              <w:br/>
+            </w:r>
+            <w:r>
+              <w:rPr>
+                <w:rFonts w:ascii="Consolas" w:hAnsi="Consolas"/>
+                <w:color w:val="141414"/>
+                <w:sz w:val="19"/>
+              </w:rPr>
+              <w:br/>
+              <w:t>// Function to find minimum</w:t>
+            </w:r>
+            <w:r>
+              <w:rPr>
+                <w:rFonts w:ascii="Consolas" w:hAnsi="Consolas"/>
+                <w:color w:val="141414"/>
+                <w:sz w:val="19"/>
+              </w:rPr>
+              <w:br/>
+              <w:t>function getMin(arr) {</w:t>
+            </w:r>
+            <w:r>
+              <w:rPr>
+                <w:rFonts w:ascii="Consolas" w:hAnsi="Consolas"/>
+                <w:color w:val="141414"/>
+                <w:sz w:val="19"/>
+              </w:rPr>
+              <w:br/>
+              <w:t xml:space="preserve">    if (arr.length === 0) return undefined;</w:t>
+            </w:r>
+            <w:r>
+              <w:rPr>
+                <w:rFonts w:ascii="Consolas" w:hAnsi="Consolas"/>
+                <w:color w:val="141414"/>
+                <w:sz w:val="19"/>
+              </w:rPr>
+              <w:br/>
+              <w:t xml:space="preserve">    let min = arr[0];</w:t>
+            </w:r>
+            <w:r>
+              <w:rPr>
+                <w:rFonts w:ascii="Consolas" w:hAnsi="Consolas"/>
+                <w:color w:val="141414"/>
+                <w:sz w:val="19"/>
+              </w:rPr>
+              <w:br/>
+              <w:t xml:space="preserve">    for (let i = 1; i &lt; arr.length; i++) {</w:t>
+            </w:r>
+            <w:r>
+              <w:rPr>
+                <w:rFonts w:ascii="Consolas" w:hAnsi="Consolas"/>
+                <w:color w:val="141414"/>
+                <w:sz w:val="19"/>
+              </w:rPr>
+              <w:br/>
+            </w:r>
+            <w:r>
+              <w:rPr>
+                <w:rFonts w:ascii="Consolas" w:hAnsi="Consolas"/>
+                <w:color w:val="141414"/>
+                <w:sz w:val="19"/>
+              </w:rPr>
+              <w:t xml:space="preserve">        if (arr[i] &lt; min) min = arr[i];</w:t>
+            </w:r>
+            <w:r>
+              <w:rPr>
+                <w:rFonts w:ascii="Consolas" w:hAnsi="Consolas"/>
+                <w:color w:val="141414"/>
+                <w:sz w:val="19"/>
+              </w:rPr>
+              <w:br/>
+              <w:t xml:space="preserve">    }</w:t>
+            </w:r>
+            <w:r>
+              <w:rPr>
+                <w:rFonts w:ascii="Consolas" w:hAnsi="Consolas"/>
+                <w:color w:val="141414"/>
+                <w:sz w:val="19"/>
+              </w:rPr>
+              <w:br/>
+              <w:t xml:space="preserve">    return min;</w:t>
+            </w:r>
+            <w:r>
+              <w:rPr>
+                <w:rFonts w:ascii="Consolas" w:hAnsi="Consolas"/>
+                <w:color w:val="141414"/>
+                <w:sz w:val="19"/>
+              </w:rPr>
+              <w:br/>
+              <w:t>}</w:t>
+            </w:r>
+            <w:r>
+              <w:rPr>
+                <w:rFonts w:ascii="Consolas" w:hAnsi="Consolas"/>
+                <w:color w:val="141414"/>
+                <w:sz w:val="19"/>
+              </w:rPr>
+              <w:br/>
+            </w:r>
+            <w:r>
+              <w:rPr>
+                <w:rFonts w:ascii="Consolas" w:hAnsi="Consolas"/>
+                <w:color w:val="141414"/>
+                <w:sz w:val="19"/>
+              </w:rPr>
+              <w:br/>
+              <w:t xml:space="preserve">// Function to check </w:t>
+            </w:r>
+            <w:proofErr w:type="spellStart"/>
+            <w:r>
+              <w:rPr>
+                <w:rFonts w:ascii="Consolas" w:hAnsi="Consolas"/>
+                <w:color w:val="141414"/>
+                <w:sz w:val="19"/>
+              </w:rPr>
+              <w:t>elemen</w:t>
+            </w:r>
+            <w:proofErr w:type="spellEnd"/>
+            <w:r>
+              <w:rPr>
+                <w:rFonts w:ascii="Consolas" w:hAnsi="Consolas"/>
+                <w:color w:val="141414"/>
+                <w:sz w:val="19"/>
+              </w:rPr>
+              <w:br/>
+              <w:t xml:space="preserve">function </w:t>
+            </w:r>
+            <w:proofErr w:type="spellStart"/>
+            <w:r>
+              <w:rPr>
+                <w:rFonts w:ascii="Consolas" w:hAnsi="Consolas"/>
+                <w:color w:val="141414"/>
+                <w:sz w:val="19"/>
+              </w:rPr>
+              <w:t>containsVal</w:t>
+            </w:r>
+            <w:proofErr w:type="spellEnd"/>
+            <w:r>
+              <w:rPr>
+                <w:rFonts w:ascii="Consolas" w:hAnsi="Consolas"/>
+                <w:color w:val="141414"/>
+                <w:sz w:val="19"/>
+              </w:rPr>
+              <w:t>(</w:t>
+            </w:r>
+            <w:proofErr w:type="spellStart"/>
+            <w:r>
+              <w:rPr>
+                <w:rFonts w:ascii="Consolas" w:hAnsi="Consolas"/>
+                <w:color w:val="141414"/>
+                <w:sz w:val="19"/>
+              </w:rPr>
+              <w:t>arr</w:t>
+            </w:r>
+            <w:proofErr w:type="spellEnd"/>
+            <w:r>
+              <w:rPr>
+                <w:rFonts w:ascii="Consolas" w:hAnsi="Consolas"/>
+                <w:color w:val="141414"/>
+                <w:sz w:val="19"/>
+              </w:rPr>
+              <w:t>, target) {</w:t>
+            </w:r>
+            <w:r>
+              <w:rPr>
+                <w:rFonts w:ascii="Consolas" w:hAnsi="Consolas"/>
+                <w:color w:val="141414"/>
+                <w:sz w:val="19"/>
+              </w:rPr>
+              <w:br/>
+              <w:t xml:space="preserve">    return arr.includes(target);</w:t>
+            </w:r>
+            <w:r>
+              <w:rPr>
+                <w:rFonts w:ascii="Consolas" w:hAnsi="Consolas"/>
+                <w:color w:val="141414"/>
+                <w:sz w:val="19"/>
+              </w:rPr>
+              <w:br/>
+              <w:t>}</w:t>
+            </w:r>
+            <w:r>
+              <w:rPr>
+                <w:rFonts w:ascii="Consolas" w:hAnsi="Consolas"/>
+                <w:color w:val="141414"/>
+                <w:sz w:val="19"/>
+              </w:rPr>
+              <w:br/>
+            </w:r>
+            <w:r>
+              <w:rPr>
+                <w:rFonts w:ascii="Consolas" w:hAnsi="Consolas"/>
+                <w:color w:val="141414"/>
+                <w:sz w:val="19"/>
+              </w:rPr>
+              <w:br/>
+              <w:t xml:space="preserve">// Function to </w:t>
+            </w:r>
+            <w:r>
+              <w:rPr>
+                <w:rFonts w:ascii="Consolas" w:hAnsi="Consolas"/>
+                <w:color w:val="141414"/>
+                <w:sz w:val="19"/>
+              </w:rPr>
+              <w:t>find</w:t>
+            </w:r>
+            <w:r>
+              <w:rPr>
+                <w:rFonts w:ascii="Consolas" w:hAnsi="Consolas"/>
+                <w:color w:val="141414"/>
+                <w:sz w:val="19"/>
+              </w:rPr>
+              <w:t xml:space="preserve"> even numbers</w:t>
+            </w:r>
+            <w:r>
+              <w:rPr>
+                <w:rFonts w:ascii="Consolas" w:hAnsi="Consolas"/>
+                <w:color w:val="141414"/>
+                <w:sz w:val="19"/>
+              </w:rPr>
+              <w:br/>
+              <w:t>function filterEvens(arr) {</w:t>
+            </w:r>
+            <w:r>
+              <w:rPr>
+                <w:rFonts w:ascii="Consolas" w:hAnsi="Consolas"/>
+                <w:color w:val="141414"/>
+                <w:sz w:val="19"/>
+              </w:rPr>
+              <w:br/>
+              <w:t xml:space="preserve">    return arr.filter(function(num) {</w:t>
+            </w:r>
+            <w:r>
+              <w:rPr>
+                <w:rFonts w:ascii="Consolas" w:hAnsi="Consolas"/>
+                <w:color w:val="141414"/>
+                <w:sz w:val="19"/>
+              </w:rPr>
+              <w:br/>
+              <w:t xml:space="preserve">        return num % 2 === 0;</w:t>
+            </w:r>
+            <w:r>
+              <w:rPr>
+                <w:rFonts w:ascii="Consolas" w:hAnsi="Consolas"/>
+                <w:color w:val="141414"/>
+                <w:sz w:val="19"/>
+              </w:rPr>
+              <w:br/>
+              <w:t xml:space="preserve">    });</w:t>
+            </w:r>
+            <w:r>
+              <w:rPr>
+                <w:rFonts w:ascii="Consolas" w:hAnsi="Consolas"/>
+                <w:color w:val="141414"/>
+                <w:sz w:val="19"/>
+              </w:rPr>
+              <w:br/>
+              <w:t>}</w:t>
+            </w:r>
+            <w:r>
+              <w:rPr>
+                <w:rFonts w:ascii="Consolas" w:hAnsi="Consolas"/>
+                <w:color w:val="141414"/>
+                <w:sz w:val="19"/>
+              </w:rPr>
+              <w:br/>
+            </w:r>
+            <w:r>
+              <w:rPr>
+                <w:rFonts w:ascii="Consolas" w:hAnsi="Consolas"/>
+                <w:color w:val="141414"/>
+                <w:sz w:val="19"/>
+              </w:rPr>
+              <w:br/>
+              <w:t>// Function to a</w:t>
+            </w:r>
+            <w:r>
+              <w:rPr>
+                <w:rFonts w:ascii="Consolas" w:hAnsi="Consolas"/>
+                <w:color w:val="141414"/>
+                <w:sz w:val="19"/>
+              </w:rPr>
+              <w:t>d</w:t>
+            </w:r>
+            <w:r>
+              <w:rPr>
+                <w:rFonts w:ascii="Consolas" w:hAnsi="Consolas"/>
+                <w:color w:val="141414"/>
+                <w:sz w:val="19"/>
+              </w:rPr>
+              <w:t>d element</w:t>
+            </w:r>
+            <w:r>
+              <w:rPr>
+                <w:rFonts w:ascii="Consolas" w:hAnsi="Consolas"/>
+                <w:color w:val="141414"/>
+                <w:sz w:val="19"/>
+              </w:rPr>
+              <w:br/>
+              <w:t>function addVal(arr, item) {</w:t>
+            </w:r>
+            <w:r>
+              <w:rPr>
+                <w:rFonts w:ascii="Consolas" w:hAnsi="Consolas"/>
+                <w:color w:val="141414"/>
+                <w:sz w:val="19"/>
+              </w:rPr>
+              <w:br/>
+              <w:t xml:space="preserve">    arr.push(item);</w:t>
+            </w:r>
+            <w:r>
+              <w:rPr>
+                <w:rFonts w:ascii="Consolas" w:hAnsi="Consolas"/>
+                <w:color w:val="141414"/>
+                <w:sz w:val="19"/>
+              </w:rPr>
+              <w:br/>
+              <w:t xml:space="preserve">    return arr;</w:t>
+            </w:r>
+            <w:r>
+              <w:rPr>
+                <w:rFonts w:ascii="Consolas" w:hAnsi="Consolas"/>
+                <w:color w:val="141414"/>
+                <w:sz w:val="19"/>
+              </w:rPr>
+              <w:br/>
+              <w:t>}</w:t>
+            </w:r>
+            <w:r>
+              <w:rPr>
+                <w:rFonts w:ascii="Consolas" w:hAnsi="Consolas"/>
+                <w:color w:val="141414"/>
+                <w:sz w:val="19"/>
+              </w:rPr>
+              <w:br/>
+            </w:r>
+            <w:r>
+              <w:rPr>
+                <w:rFonts w:ascii="Consolas" w:hAnsi="Consolas"/>
+                <w:color w:val="141414"/>
+                <w:sz w:val="19"/>
+              </w:rPr>
+              <w:lastRenderedPageBreak/>
+              <w:br/>
+              <w:t>// Function to remove last element</w:t>
+            </w:r>
+            <w:r>
+              <w:rPr>
+                <w:rFonts w:ascii="Consolas" w:hAnsi="Consolas"/>
+                <w:color w:val="141414"/>
+                <w:sz w:val="19"/>
+              </w:rPr>
+              <w:br/>
+              <w:t>function removeVal(arr) {</w:t>
+            </w:r>
+            <w:r>
+              <w:rPr>
+                <w:rFonts w:ascii="Consolas" w:hAnsi="Consolas"/>
+                <w:color w:val="141414"/>
+                <w:sz w:val="19"/>
+              </w:rPr>
+              <w:br/>
+              <w:t xml:space="preserve">    arr.pop();</w:t>
+            </w:r>
+            <w:r>
+              <w:rPr>
+                <w:rFonts w:ascii="Consolas" w:hAnsi="Consolas"/>
+                <w:color w:val="141414"/>
+                <w:sz w:val="19"/>
+              </w:rPr>
+              <w:br/>
+              <w:t xml:space="preserve">    return arr;</w:t>
+            </w:r>
+            <w:r>
+              <w:rPr>
+                <w:rFonts w:ascii="Consolas" w:hAnsi="Consolas"/>
+                <w:color w:val="141414"/>
+                <w:sz w:val="19"/>
+              </w:rPr>
+              <w:br/>
+              <w:t>}</w:t>
+            </w:r>
+            <w:r>
+              <w:rPr>
+                <w:rFonts w:ascii="Consolas" w:hAnsi="Consolas"/>
+                <w:color w:val="141414"/>
+                <w:sz w:val="19"/>
+              </w:rPr>
+              <w:br/>
+            </w:r>
+            <w:r>
+              <w:rPr>
+                <w:rFonts w:ascii="Consolas" w:hAnsi="Consolas"/>
+                <w:color w:val="141414"/>
+                <w:sz w:val="19"/>
+              </w:rPr>
+              <w:br/>
+            </w:r>
+            <w:r>
+              <w:rPr>
+                <w:rFonts w:ascii="Consolas" w:hAnsi="Consolas"/>
+                <w:color w:val="141414"/>
+                <w:sz w:val="19"/>
+              </w:rPr>
+              <w:t>let dataset = [10, 25, 30, 45, 50];</w:t>
+            </w:r>
+            <w:r>
+              <w:rPr>
+                <w:rFonts w:ascii="Consolas" w:hAnsi="Consolas"/>
+                <w:color w:val="141414"/>
+                <w:sz w:val="19"/>
+              </w:rPr>
+              <w:br/>
+            </w:r>
+            <w:r>
+              <w:rPr>
+                <w:rFonts w:ascii="Consolas" w:hAnsi="Consolas"/>
+                <w:color w:val="141414"/>
+                <w:sz w:val="19"/>
+              </w:rPr>
+              <w:br/>
+              <w:t>console.log("=== LAB EXP 03: ARRAYS &amp; FUNCTIONS ===");</w:t>
+            </w:r>
+            <w:r>
+              <w:rPr>
+                <w:rFonts w:ascii="Consolas" w:hAnsi="Consolas"/>
+                <w:color w:val="141414"/>
+                <w:sz w:val="19"/>
+              </w:rPr>
+              <w:br/>
+            </w:r>
+            <w:r>
+              <w:rPr>
+                <w:rFonts w:ascii="Consolas" w:hAnsi="Consolas"/>
+                <w:color w:val="141414"/>
+                <w:sz w:val="19"/>
+              </w:rPr>
+              <w:br/>
+              <w:t>console.log("\n--- Test 1: Print List ---");</w:t>
+            </w:r>
+            <w:r>
+              <w:rPr>
+                <w:rFonts w:ascii="Consolas" w:hAnsi="Consolas"/>
+                <w:color w:val="141414"/>
+                <w:sz w:val="19"/>
+              </w:rPr>
+              <w:br/>
+              <w:t>printList(dataset);</w:t>
+            </w:r>
+            <w:r>
+              <w:rPr>
+                <w:rFonts w:ascii="Consolas" w:hAnsi="Consolas"/>
+                <w:color w:val="141414"/>
+                <w:sz w:val="19"/>
+              </w:rPr>
+              <w:br/>
+            </w:r>
+            <w:r>
+              <w:rPr>
+                <w:rFonts w:ascii="Consolas" w:hAnsi="Consolas"/>
+                <w:color w:val="141414"/>
+                <w:sz w:val="19"/>
+              </w:rPr>
+              <w:br/>
+              <w:t>console.log("\n--- Test 2: Calculate Sum ---");</w:t>
+            </w:r>
+            <w:r>
+              <w:rPr>
+                <w:rFonts w:ascii="Consolas" w:hAnsi="Consolas"/>
+                <w:color w:val="141414"/>
+                <w:sz w:val="19"/>
+              </w:rPr>
+              <w:br/>
+              <w:t>console.log("Total Sum =", getSum(dataset));</w:t>
+            </w:r>
+            <w:r>
+              <w:rPr>
+                <w:rFonts w:ascii="Consolas" w:hAnsi="Consolas"/>
+                <w:color w:val="141414"/>
+                <w:sz w:val="19"/>
+              </w:rPr>
+              <w:br/>
+            </w:r>
+            <w:r>
+              <w:rPr>
+                <w:rFonts w:ascii="Consolas" w:hAnsi="Consolas"/>
+                <w:color w:val="141414"/>
+                <w:sz w:val="19"/>
+              </w:rPr>
+              <w:br/>
+              <w:t>console.log("\n--- Test 3: Calculate Average ---");</w:t>
+            </w:r>
+            <w:r>
+              <w:rPr>
+                <w:rFonts w:ascii="Consolas" w:hAnsi="Consolas"/>
+                <w:color w:val="141414"/>
+                <w:sz w:val="19"/>
+              </w:rPr>
+              <w:br/>
+              <w:t>console.log("Average =", getAvg(dataset));</w:t>
+            </w:r>
+            <w:r>
+              <w:rPr>
+                <w:rFonts w:ascii="Consolas" w:hAnsi="Consolas"/>
+                <w:color w:val="141414"/>
+                <w:sz w:val="19"/>
+              </w:rPr>
+              <w:br/>
+            </w:r>
+            <w:r>
+              <w:rPr>
+                <w:rFonts w:ascii="Consolas" w:hAnsi="Consolas"/>
+                <w:color w:val="141414"/>
+                <w:sz w:val="19"/>
+              </w:rPr>
+              <w:br/>
+              <w:t>console.log("\n--- Test 4: Find Max &amp; Min ---");</w:t>
+            </w:r>
+            <w:r>
+              <w:rPr>
+                <w:rFonts w:ascii="Consolas" w:hAnsi="Consolas"/>
+                <w:color w:val="141414"/>
+                <w:sz w:val="19"/>
+              </w:rPr>
+              <w:br/>
+              <w:t>console.log("Max Value =", getMax(dataset));</w:t>
+            </w:r>
+            <w:r>
+              <w:rPr>
+                <w:rFonts w:ascii="Consolas" w:hAnsi="Consolas"/>
+                <w:color w:val="141414"/>
+                <w:sz w:val="19"/>
+              </w:rPr>
+              <w:br/>
+              <w:t>console.log("Min Value =", getMin(dataset));</w:t>
+            </w:r>
+            <w:r>
+              <w:rPr>
+                <w:rFonts w:ascii="Consolas" w:hAnsi="Consolas"/>
+                <w:color w:val="141414"/>
+                <w:sz w:val="19"/>
+              </w:rPr>
+              <w:br/>
+            </w:r>
+            <w:r>
+              <w:rPr>
+                <w:rFonts w:ascii="Consolas" w:hAnsi="Consolas"/>
+                <w:color w:val="141414"/>
+                <w:sz w:val="19"/>
+              </w:rPr>
+              <w:br/>
+            </w:r>
+            <w:r>
+              <w:rPr>
+                <w:rFonts w:ascii="Consolas" w:hAnsi="Consolas"/>
+                <w:color w:val="141414"/>
+                <w:sz w:val="19"/>
+              </w:rPr>
+              <w:t>console.log("\n--- Test 5: Search Operations ---");</w:t>
+            </w:r>
+            <w:r>
+              <w:rPr>
+                <w:rFonts w:ascii="Consolas" w:hAnsi="Consolas"/>
+                <w:color w:val="141414"/>
+                <w:sz w:val="19"/>
+              </w:rPr>
+              <w:br/>
+              <w:t>console.log("Search 30:", containsVal(dataset, 30));</w:t>
+            </w:r>
+            <w:r>
+              <w:rPr>
+                <w:rFonts w:ascii="Consolas" w:hAnsi="Consolas"/>
+                <w:color w:val="141414"/>
+                <w:sz w:val="19"/>
+              </w:rPr>
+              <w:br/>
+              <w:t>console.log("Search 99:", containsVal(dataset, 99));</w:t>
+            </w:r>
+            <w:r>
+              <w:rPr>
+                <w:rFonts w:ascii="Consolas" w:hAnsi="Consolas"/>
+                <w:color w:val="141414"/>
+                <w:sz w:val="19"/>
+              </w:rPr>
+              <w:br/>
+            </w:r>
+            <w:r>
+              <w:rPr>
+                <w:rFonts w:ascii="Consolas" w:hAnsi="Consolas"/>
+                <w:color w:val="141414"/>
+                <w:sz w:val="19"/>
+              </w:rPr>
+              <w:br/>
+              <w:t>console.log("\n--- Test 6: Filter Even Numbers ---");</w:t>
+            </w:r>
+            <w:r>
+              <w:rPr>
+                <w:rFonts w:ascii="Consolas" w:hAnsi="Consolas"/>
+                <w:color w:val="141414"/>
+                <w:sz w:val="19"/>
+              </w:rPr>
+              <w:br/>
+              <w:t>console.log("Evens:", filterEvens(dataset));</w:t>
+            </w:r>
+            <w:r>
+              <w:rPr>
+                <w:rFonts w:ascii="Consolas" w:hAnsi="Consolas"/>
+                <w:color w:val="141414"/>
+                <w:sz w:val="19"/>
+              </w:rPr>
+              <w:br/>
+            </w:r>
+            <w:r>
+              <w:rPr>
+                <w:rFonts w:ascii="Consolas" w:hAnsi="Consolas"/>
+                <w:color w:val="141414"/>
+                <w:sz w:val="19"/>
+              </w:rPr>
+              <w:br/>
+              <w:t>console.log("\n--- Test 7: Array Modifications ---");</w:t>
+            </w:r>
+            <w:r>
+              <w:rPr>
+                <w:rFonts w:ascii="Consolas" w:hAnsi="Consolas"/>
+                <w:color w:val="141414"/>
+                <w:sz w:val="19"/>
+              </w:rPr>
+              <w:br/>
+              <w:t>let added = addVal([...dataset], 60);</w:t>
+            </w:r>
+            <w:r>
+              <w:rPr>
+                <w:rFonts w:ascii="Consolas" w:hAnsi="Consolas"/>
+                <w:color w:val="141414"/>
+                <w:sz w:val="19"/>
+              </w:rPr>
+              <w:br/>
+              <w:t>console.log("After addVal(60):");</w:t>
+            </w:r>
+            <w:r>
+              <w:rPr>
+                <w:rFonts w:ascii="Consolas" w:hAnsi="Consolas"/>
+                <w:color w:val="141414"/>
+                <w:sz w:val="19"/>
+              </w:rPr>
+              <w:br/>
+              <w:t>printList(added);</w:t>
+            </w:r>
+            <w:r>
+              <w:rPr>
+                <w:rFonts w:ascii="Consolas" w:hAnsi="Consolas"/>
+                <w:color w:val="141414"/>
+                <w:sz w:val="19"/>
+              </w:rPr>
+              <w:br/>
+            </w:r>
+            <w:r>
+              <w:rPr>
+                <w:rFonts w:ascii="Consolas" w:hAnsi="Consolas"/>
+                <w:color w:val="141414"/>
+                <w:sz w:val="19"/>
+              </w:rPr>
+              <w:br/>
+              <w:t>let removed = removeVal([...dataset]);</w:t>
+            </w:r>
+            <w:r>
+              <w:rPr>
+                <w:rFonts w:ascii="Consolas" w:hAnsi="Consolas"/>
+                <w:color w:val="141414"/>
+                <w:sz w:val="19"/>
+              </w:rPr>
+              <w:br/>
+              <w:t>console.log("After removeVal():");</w:t>
+            </w:r>
+            <w:r>
+              <w:rPr>
+                <w:rFonts w:ascii="Consolas" w:hAnsi="Consolas"/>
+                <w:color w:val="141414"/>
+                <w:sz w:val="19"/>
+              </w:rPr>
+              <w:br/>
+              <w:t>printList(removed);</w:t>
+            </w:r>
+            <w:r>
+              <w:rPr>
+                <w:rFonts w:ascii="Consolas" w:hAnsi="Consolas"/>
+                <w:color w:val="141414"/>
+                <w:sz w:val="19"/>
+              </w:rPr>
+              <w:br/>
+            </w:r>
+            <w:r>
+              <w:rPr>
+                <w:rFonts w:ascii="Consolas" w:hAnsi="Consolas"/>
+                <w:color w:val="141414"/>
+                <w:sz w:val="19"/>
+              </w:rPr>
+              <w:br/>
+            </w:r>
+            <w:r>
+              <w:rPr>
+                <w:rFonts w:ascii="Consolas" w:hAnsi="Consolas"/>
+                <w:color w:val="141414"/>
+                <w:sz w:val="19"/>
+              </w:rPr>
+              <w:t>// Edge Cases / Manual Failures</w:t>
+            </w:r>
+            <w:r>
+              <w:rPr>
+                <w:rFonts w:ascii="Consolas" w:hAnsi="Consolas"/>
+                <w:color w:val="141414"/>
+                <w:sz w:val="19"/>
+              </w:rPr>
+              <w:br/>
+              <w:t>console.log("\n--- Test 8: Manual Edge Cases &amp; Failures ---");</w:t>
+            </w:r>
+            <w:r>
+              <w:rPr>
+                <w:rFonts w:ascii="Consolas" w:hAnsi="Consolas"/>
+                <w:color w:val="141414"/>
+                <w:sz w:val="19"/>
+              </w:rPr>
+              <w:br/>
+              <w:t>let emptySet = [];</w:t>
+            </w:r>
+            <w:r>
+              <w:rPr>
+                <w:rFonts w:ascii="Consolas" w:hAnsi="Consolas"/>
+                <w:color w:val="141414"/>
+                <w:sz w:val="19"/>
+              </w:rPr>
+              <w:br/>
+              <w:t>console.log("Empty Array Average:", getAvg(emptySet)); // Returns 0</w:t>
+            </w:r>
+            <w:r>
+              <w:rPr>
+                <w:rFonts w:ascii="Consolas" w:hAnsi="Consolas"/>
+                <w:color w:val="141414"/>
+                <w:sz w:val="19"/>
+              </w:rPr>
+              <w:br/>
+              <w:t>console.log("Empty Array Max:", getMax(emptySet));       // Returns undefined</w:t>
+            </w:r>
+            <w:r>
+              <w:rPr>
+                <w:rFonts w:ascii="Consolas" w:hAnsi="Consolas"/>
+                <w:color w:val="141414"/>
+                <w:sz w:val="19"/>
+              </w:rPr>
+              <w:br/>
+              <w:t>console.log("Type Mismatch Search ('30'):", containsVal(dataset, "30")); // Strict type check fail</w:t>
+            </w:r>
+          </w:p>
+        </w:tc>
+      </w:tr>
+    </w:tbl>
     <w:p>
       <w:pPr>
         <w:keepNext/>
@@ -639,87 +1791,312 @@
       </w:pPr>
       <w:r>
         <w:rPr>
+          <w:rFonts w:ascii="Calibri" w:hAnsi="Calibri"/>
           <w:b/>
+          <w:color w:val="000000"/>
+          <w:sz w:val="24"/>
         </w:rPr>
         <w:lastRenderedPageBreak/>
         <w:t>7. CODE EXPLANATION</w:t>
       </w:r>
     </w:p>
     <w:p>
+      <w:pPr>
+        <w:spacing w:after="60"/>
+      </w:pPr>
       <w:r>
-        <w:t>• const marks = [...]: Declares an array holding student score values.</w:t>
+        <w:rPr>
+          <w:rFonts w:ascii="Calibri" w:hAnsi="Calibri"/>
+          <w:b/>
+          <w:color w:val="000000"/>
+        </w:rPr>
+        <w:t>• printList(arr):</w:t>
       </w:r>
       <w:r>
-        <w:br/>
-        <w:t>• calculateAverage(arr): Standard function declaration using reduce() to sum elements and compute average.</w:t>
+        <w:rPr>
+          <w:rFonts w:ascii="Calibri" w:hAnsi="Calibri"/>
+          <w:color w:val="000000"/>
+        </w:rPr>
+        <w:t xml:space="preserve"> Concatenates array items into a single space-delimited string using </w:t>
+      </w:r>
+      <w:proofErr w:type="gramStart"/>
+      <w:r>
+        <w:rPr>
+          <w:rFonts w:ascii="Calibri" w:hAnsi="Calibri"/>
+          <w:color w:val="000000"/>
+        </w:rPr>
+        <w:t>arr.join</w:t>
+      </w:r>
+      <w:proofErr w:type="gramEnd"/>
+      <w:r>
+        <w:rPr>
+          <w:rFonts w:ascii="Calibri" w:hAnsi="Calibri"/>
+          <w:color w:val="000000"/>
+        </w:rPr>
+        <w:t>(' ') for clean console logging.</w:t>
+      </w:r>
+    </w:p>
+    <w:p>
+      <w:pPr>
+        <w:spacing w:after="60"/>
+      </w:pPr>
+      <w:r>
+        <w:rPr>
+          <w:rFonts w:ascii="Calibri" w:hAnsi="Calibri"/>
+          <w:b/>
+          <w:color w:val="000000"/>
+        </w:rPr>
+        <w:t>• getSum(arr) &amp; getAvg(arr):</w:t>
       </w:r>
       <w:r>
-        <w:br/>
-        <w:t>• arr.filter(score =&gt; score &gt;= 80): Uses an ES6 arrow function to extract scores meeting condition.</w:t>
+        <w:rPr>
+          <w:rFonts w:ascii="Calibri" w:hAnsi="Calibri"/>
+          <w:color w:val="000000"/>
+        </w:rPr>
+        <w:t xml:space="preserve"> Iterates through array elements to calculate sum. getAvg includes a zero-length guard clause to prevent division-by-zero errors.</w:t>
+      </w:r>
+    </w:p>
+    <w:p>
+      <w:pPr>
+        <w:spacing w:after="60"/>
+      </w:pPr>
+      <w:r>
+        <w:rPr>
+          <w:rFonts w:ascii="Calibri" w:hAnsi="Calibri"/>
+          <w:b/>
+          <w:color w:val="000000"/>
+        </w:rPr>
+        <w:lastRenderedPageBreak/>
+        <w:t>• getMax(arr) &amp; getMin(arr):</w:t>
       </w:r>
       <w:r>
-        <w:br/>
-        <w:t>• Math.max(...arr) &amp; Math.min(...arr): Uses spread operator to pass array items into Math library utility methods.</w:t>
+        <w:rPr>
+          <w:rFonts w:ascii="Calibri" w:hAnsi="Calibri"/>
+          <w:color w:val="000000"/>
+        </w:rPr>
+        <w:t xml:space="preserve"> Sequential iteration tracking extreme values. Returns undefined if the passed array is empty.</w:t>
+      </w:r>
+    </w:p>
+    <w:p>
+      <w:pPr>
+        <w:spacing w:after="60"/>
+      </w:pPr>
+      <w:r>
+        <w:rPr>
+          <w:rFonts w:ascii="Calibri" w:hAnsi="Calibri"/>
+          <w:b/>
+          <w:color w:val="000000"/>
+        </w:rPr>
+        <w:t xml:space="preserve">• </w:t>
+      </w:r>
+      <w:proofErr w:type="gramStart"/>
+      <w:r>
+        <w:rPr>
+          <w:rFonts w:ascii="Calibri" w:hAnsi="Calibri"/>
+          <w:b/>
+          <w:color w:val="000000"/>
+        </w:rPr>
+        <w:t>containsVal(</w:t>
+      </w:r>
+      <w:proofErr w:type="gramEnd"/>
+      <w:r>
+        <w:rPr>
+          <w:rFonts w:ascii="Calibri" w:hAnsi="Calibri"/>
+          <w:b/>
+          <w:color w:val="000000"/>
+        </w:rPr>
+        <w:t>arr, target):</w:t>
       </w:r>
       <w:r>
-        <w:br/>
-        <w:t>• document.getElementById().innerHTML: Dynamically injects formatted results into web page DOM.</w:t>
+        <w:rPr>
+          <w:rFonts w:ascii="Calibri" w:hAnsi="Calibri"/>
+          <w:color w:val="000000"/>
+        </w:rPr>
+        <w:t xml:space="preserve"> Uses native </w:t>
+      </w:r>
+      <w:proofErr w:type="gramStart"/>
+      <w:r>
+        <w:rPr>
+          <w:rFonts w:ascii="Calibri" w:hAnsi="Calibri"/>
+          <w:color w:val="000000"/>
+        </w:rPr>
+        <w:t>Array.prototype.includes</w:t>
+      </w:r>
+      <w:proofErr w:type="gramEnd"/>
+      <w:r>
+        <w:rPr>
+          <w:rFonts w:ascii="Calibri" w:hAnsi="Calibri"/>
+          <w:color w:val="000000"/>
+        </w:rPr>
+        <w:t>() for checking element presence (uses strict equality comparison).</w:t>
+      </w:r>
+    </w:p>
+    <w:p>
+      <w:pPr>
+        <w:spacing w:after="60"/>
+      </w:pPr>
+      <w:r>
+        <w:rPr>
+          <w:rFonts w:ascii="Calibri" w:hAnsi="Calibri"/>
+          <w:b/>
+          <w:color w:val="000000"/>
+        </w:rPr>
+        <w:t>• filterEvens(arr):</w:t>
+      </w:r>
+      <w:r>
+        <w:rPr>
+          <w:rFonts w:ascii="Calibri" w:hAnsi="Calibri"/>
+          <w:color w:val="000000"/>
+        </w:rPr>
+        <w:t xml:space="preserve"> Employs functional array filtering with an anonymous predicate function returning true for even integers.</w:t>
+      </w:r>
+    </w:p>
+    <w:p>
+      <w:pPr>
+        <w:spacing w:after="60"/>
+      </w:pPr>
+      <w:r>
+        <w:rPr>
+          <w:rFonts w:ascii="Calibri" w:hAnsi="Calibri"/>
+          <w:b/>
+          <w:color w:val="000000"/>
+        </w:rPr>
+        <w:t xml:space="preserve">• </w:t>
+      </w:r>
+      <w:proofErr w:type="gramStart"/>
+      <w:r>
+        <w:rPr>
+          <w:rFonts w:ascii="Calibri" w:hAnsi="Calibri"/>
+          <w:b/>
+          <w:color w:val="000000"/>
+        </w:rPr>
+        <w:t>addVal(</w:t>
+      </w:r>
+      <w:proofErr w:type="gramEnd"/>
+      <w:r>
+        <w:rPr>
+          <w:rFonts w:ascii="Calibri" w:hAnsi="Calibri"/>
+          <w:b/>
+          <w:color w:val="000000"/>
+        </w:rPr>
+        <w:t>arr, item) &amp; removeVal(arr):</w:t>
+      </w:r>
+      <w:r>
+        <w:rPr>
+          <w:rFonts w:ascii="Calibri" w:hAnsi="Calibri"/>
+          <w:color w:val="000000"/>
+        </w:rPr>
+        <w:t xml:space="preserve"> Modifies array boundaries using </w:t>
+      </w:r>
+      <w:proofErr w:type="gramStart"/>
+      <w:r>
+        <w:rPr>
+          <w:rFonts w:ascii="Calibri" w:hAnsi="Calibri"/>
+          <w:color w:val="000000"/>
+        </w:rPr>
+        <w:t>push(</w:t>
+      </w:r>
+      <w:proofErr w:type="gramEnd"/>
+      <w:r>
+        <w:rPr>
+          <w:rFonts w:ascii="Calibri" w:hAnsi="Calibri"/>
+          <w:color w:val="000000"/>
+        </w:rPr>
+        <w:t xml:space="preserve">) and </w:t>
+      </w:r>
+      <w:proofErr w:type="gramStart"/>
+      <w:r>
+        <w:rPr>
+          <w:rFonts w:ascii="Calibri" w:hAnsi="Calibri"/>
+          <w:color w:val="000000"/>
+        </w:rPr>
+        <w:t>pop(</w:t>
+      </w:r>
+      <w:proofErr w:type="gramEnd"/>
+      <w:r>
+        <w:rPr>
+          <w:rFonts w:ascii="Calibri" w:hAnsi="Calibri"/>
+          <w:color w:val="000000"/>
+        </w:rPr>
+        <w:t>) mutator methods.</w:t>
+      </w:r>
+    </w:p>
+    <w:p>
+      <w:pPr>
+        <w:spacing w:after="60"/>
+      </w:pPr>
+      <w:r>
+        <w:rPr>
+          <w:rFonts w:ascii="Calibri" w:hAnsi="Calibri"/>
+          <w:b/>
+          <w:color w:val="000000"/>
+        </w:rPr>
+        <w:t>• Spread Operator ([...dataset]):</w:t>
+      </w:r>
+      <w:r>
+        <w:rPr>
+          <w:rFonts w:ascii="Calibri" w:hAnsi="Calibri"/>
+          <w:color w:val="000000"/>
+        </w:rPr>
+        <w:t xml:space="preserve"> Ensures functional purity during test cases by creating shallow copies, preserving the original array.</w:t>
       </w:r>
     </w:p>
     <w:p>
       <w:pPr>
         <w:keepNext/>
         <w:spacing w:before="240" w:after="80"/>
+        <w:rPr>
+          <w:rFonts w:ascii="Calibri" w:hAnsi="Calibri"/>
+          <w:b/>
+          <w:color w:val="000000"/>
+          <w:sz w:val="24"/>
+        </w:rPr>
       </w:pPr>
       <w:r>
         <w:rPr>
+          <w:rFonts w:ascii="Calibri" w:hAnsi="Calibri"/>
           <w:b/>
+          <w:color w:val="000000"/>
+          <w:sz w:val="24"/>
         </w:rPr>
-        <w:t>8. TEST CASES AND EXECUTION DATA</w:t>
+        <w:t xml:space="preserve">8. </w:t>
       </w:r>
-    </w:p>
-    <w:p>
+      <w:proofErr w:type="gramStart"/>
       <w:r>
-        <w:t>1. TC-01: Array Declaration -&gt; Array [85, 92, 78, 64, 95, 88] initialized correctly -&gt; Passed</w:t>
+        <w:rPr>
+          <w:rFonts w:ascii="Calibri" w:hAnsi="Calibri"/>
+          <w:b/>
+          <w:color w:val="000000"/>
+          <w:sz w:val="24"/>
+        </w:rPr>
+        <w:t>OUTPUT :</w:t>
       </w:r>
-      <w:r>
-        <w:br/>
-        <w:t>2. TC-02: Average Calculation -&gt; Correctly computes average score as 83.67 -&gt; Passed</w:t>
-      </w:r>
-      <w:r>
-        <w:br/>
-        <w:t>3. TC-03: Filtering Operation -&gt; Successfully extracts sub-array [85, 92, 95, 88] -&gt; Passed</w:t>
-      </w:r>
-      <w:r>
-        <w:br/>
-        <w:t>4. TC-04: Min/Max Evaluation -&gt; Correctly returns Highest: 95 and Lowest: 64 -&gt; Passed</w:t>
-      </w:r>
+      <w:proofErr w:type="gramEnd"/>
     </w:p>
     <w:p>
       <w:pPr>
         <w:keepNext/>
         <w:spacing w:before="240" w:after="80"/>
+        <w:rPr>
+          <w:rFonts w:ascii="Calibri" w:hAnsi="Calibri"/>
+          <w:b/>
+          <w:color w:val="000000"/>
+          <w:sz w:val="24"/>
+        </w:rPr>
       </w:pPr>
       <w:r>
         <w:rPr>
+          <w:rFonts w:ascii="Calibri" w:hAnsi="Calibri"/>
           <w:b/>
+          <w:noProof/>
+          <w:color w:val="000000"/>
+          <w:sz w:val="24"/>
         </w:rPr>
-        <w:t>9. OUTPUT</w:t>
-      </w:r>
-    </w:p>
-    <w:p>
-      <w:r>
-        <w:t>GitHub Link: https://github.com/hv455253-cmyk/FSWD-Lab/tree/main/Record/week-3</w:t>
-      </w:r>
-      <w:r>
-        <w:br/>
-      </w:r>
-      <w:r>
         <w:drawing>
-          <wp:inline distT="0" distB="0" distL="0" distR="0" wp14:anchorId="0F669A3B" wp14:editId="706A97A3">
-            <wp:extent cx="5943600" cy="3077210"/>
-            <wp:effectExtent l="0" t="0" r="0" b="8890"/>
-            <wp:docPr id="472804858" name="Picture 1"/>
+          <wp:inline distT="0" distB="0" distL="0" distR="0" wp14:anchorId="328DDE6F" wp14:editId="079B0BEA">
+            <wp:extent cx="4064209" cy="4197566"/>
+            <wp:effectExtent l="0" t="0" r="0" b="0"/>
+            <wp:docPr id="936332610" name="Picture 1"/>
             <wp:cNvGraphicFramePr>
               <a:graphicFrameLocks xmlns:a="http://schemas.openxmlformats.org/drawingml/2006/main" noChangeAspect="1"/>
             </wp:cNvGraphicFramePr>
@@ -727,7 +2104,7 @@
               <a:graphicData uri="http://schemas.openxmlformats.org/drawingml/2006/picture">
                 <pic:pic xmlns:pic="http://schemas.openxmlformats.org/drawingml/2006/picture">
                   <pic:nvPicPr>
-                    <pic:cNvPr id="472804858" name=""/>
+                    <pic:cNvPr id="936332610" name=""/>
                     <pic:cNvPicPr/>
                   </pic:nvPicPr>
                   <pic:blipFill>
@@ -739,7 +2116,7 @@
                   <pic:spPr>
                     <a:xfrm>
                       <a:off x="0" y="0"/>
-                      <a:ext cx="5943600" cy="3077210"/>
+                      <a:ext cx="4064209" cy="4197566"/>
                     </a:xfrm>
                     <a:prstGeom prst="rect">
                       <a:avLst/>
@@ -751,9 +2128,6 @@
           </wp:inline>
         </w:drawing>
       </w:r>
-      <w:r>
-        <w:t xml:space="preserve"> </w:t>
-      </w:r>
     </w:p>
     <w:p>
       <w:pPr>
@@ -762,62 +2136,314 @@
       </w:pPr>
       <w:r>
         <w:rPr>
+          <w:rFonts w:ascii="Calibri" w:hAnsi="Calibri"/>
           <w:b/>
+          <w:color w:val="000000"/>
+          <w:sz w:val="24"/>
         </w:rPr>
-        <w:t>10. RESULT</w:t>
-      </w:r>
-    </w:p>
-    <w:p>
-      <w:r>
-        <w:t>JavaScript basic operations including array initialization, iteration methods, and custom utility functions were successfully created, executed, and verified.</w:t>
+        <w:t>9. RESULT</w:t>
       </w:r>
     </w:p>
     <w:p>
       <w:pPr>
-        <w:spacing w:before="360" w:after="80"/>
+        <w:spacing w:after="240"/>
       </w:pPr>
       <w:r>
         <w:rPr>
-          <w:b/>
-          <w:sz w:val="22"/>
+          <w:rFonts w:ascii="Calibri" w:hAnsi="Calibri"/>
+          <w:color w:val="000000"/>
         </w:rPr>
-        <w:t>RUBRIC EVALUATION (Faculty Use Only)</w:t>
+        <w:t>JavaScript basic operations including array initialization, iteration methods, and custom utility functions were successfully implemented, executed, and verified across standard and edge test scenarios.</w:t>
       </w:r>
     </w:p>
-    <w:p>
-      <w:pPr>
-        <w:spacing w:line="312" w:lineRule="auto"/>
-      </w:pPr>
-      <w:r>
-        <w:lastRenderedPageBreak/>
-        <w:t>Design &amp; Logic (5 Marks): _________</w:t>
-      </w:r>
-      <w:r>
-        <w:br/>
-        <w:t>Execution &amp; Output (5 Marks): _________</w:t>
-      </w:r>
-      <w:r>
-        <w:br/>
-        <w:t>Viva &amp; Record (5 Marks): _________</w:t>
-      </w:r>
-      <w:r>
-        <w:br/>
-      </w:r>
-      <w:r>
-        <w:br/>
-        <w:t>TOTAL MARKS: [      / 15 ]</w:t>
-      </w:r>
-      <w:r>
-        <w:br/>
-      </w:r>
-      <w:r>
-        <w:br/>
-        <w:t>Faculty Signature: _______________________</w:t>
-      </w:r>
-    </w:p>
+    <w:tbl>
+      <w:tblPr>
+        <w:tblW w:w="0" w:type="auto"/>
+        <w:jc w:val="center"/>
+        <w:tblLook w:val="04A0" w:firstRow="1" w:lastRow="0" w:firstColumn="1" w:lastColumn="0" w:noHBand="0" w:noVBand="1"/>
+      </w:tblPr>
+      <w:tblGrid>
+        <w:gridCol w:w="5033"/>
+        <w:gridCol w:w="4706"/>
+      </w:tblGrid>
+      <w:tr>
+        <w:trPr>
+          <w:jc w:val="center"/>
+        </w:trPr>
+        <w:tc>
+          <w:tcPr>
+            <w:tcW w:w="5040" w:type="dxa"/>
+            <w:tcBorders>
+              <w:top w:val="single" w:sz="4" w:space="0" w:color="000000"/>
+              <w:left w:val="single" w:sz="4" w:space="0" w:color="000000"/>
+              <w:bottom w:val="single" w:sz="4" w:space="0" w:color="000000"/>
+              <w:right w:val="single" w:sz="4" w:space="0" w:color="000000"/>
+            </w:tcBorders>
+            <w:tcMar>
+              <w:top w:w="80" w:type="dxa"/>
+              <w:left w:w="100" w:type="dxa"/>
+              <w:bottom w:w="80" w:type="dxa"/>
+              <w:right w:w="100" w:type="dxa"/>
+            </w:tcMar>
+          </w:tcPr>
+          <w:p>
+            <w:pPr>
+              <w:spacing w:before="80" w:after="80"/>
+            </w:pPr>
+            <w:r>
+              <w:rPr>
+                <w:rFonts w:ascii="Calibri" w:hAnsi="Calibri"/>
+                <w:color w:val="000000"/>
+                <w:sz w:val="21"/>
+              </w:rPr>
+              <w:t>Design &amp; Logic (5 Marks):</w:t>
+            </w:r>
+          </w:p>
+        </w:tc>
+        <w:tc>
+          <w:tcPr>
+            <w:tcW w:w="4709" w:type="dxa"/>
+            <w:tcBorders>
+              <w:top w:val="single" w:sz="4" w:space="0" w:color="000000"/>
+              <w:left w:val="single" w:sz="4" w:space="0" w:color="000000"/>
+              <w:bottom w:val="single" w:sz="4" w:space="0" w:color="000000"/>
+              <w:right w:val="single" w:sz="4" w:space="0" w:color="000000"/>
+            </w:tcBorders>
+            <w:tcMar>
+              <w:top w:w="80" w:type="dxa"/>
+              <w:left w:w="100" w:type="dxa"/>
+              <w:bottom w:w="80" w:type="dxa"/>
+              <w:right w:w="100" w:type="dxa"/>
+            </w:tcMar>
+          </w:tcPr>
+          <w:p>
+            <w:pPr>
+              <w:spacing w:before="80" w:after="80"/>
+            </w:pPr>
+            <w:r>
+              <w:rPr>
+                <w:rFonts w:ascii="Calibri" w:hAnsi="Calibri"/>
+                <w:color w:val="000000"/>
+                <w:sz w:val="21"/>
+              </w:rPr>
+              <w:t>_________</w:t>
+            </w:r>
+          </w:p>
+        </w:tc>
+      </w:tr>
+      <w:tr>
+        <w:trPr>
+          <w:jc w:val="center"/>
+        </w:trPr>
+        <w:tc>
+          <w:tcPr>
+            <w:tcW w:w="5040" w:type="dxa"/>
+            <w:tcBorders>
+              <w:top w:val="single" w:sz="4" w:space="0" w:color="000000"/>
+              <w:left w:val="single" w:sz="4" w:space="0" w:color="000000"/>
+              <w:bottom w:val="single" w:sz="4" w:space="0" w:color="000000"/>
+              <w:right w:val="single" w:sz="4" w:space="0" w:color="000000"/>
+            </w:tcBorders>
+            <w:tcMar>
+              <w:top w:w="80" w:type="dxa"/>
+              <w:left w:w="100" w:type="dxa"/>
+              <w:bottom w:w="80" w:type="dxa"/>
+              <w:right w:w="100" w:type="dxa"/>
+            </w:tcMar>
+          </w:tcPr>
+          <w:p>
+            <w:pPr>
+              <w:spacing w:before="80" w:after="80"/>
+            </w:pPr>
+            <w:r>
+              <w:rPr>
+                <w:rFonts w:ascii="Calibri" w:hAnsi="Calibri"/>
+                <w:color w:val="000000"/>
+                <w:sz w:val="21"/>
+              </w:rPr>
+              <w:t>Execution &amp; Output (5 Marks):</w:t>
+            </w:r>
+          </w:p>
+        </w:tc>
+        <w:tc>
+          <w:tcPr>
+            <w:tcW w:w="4709" w:type="dxa"/>
+            <w:tcBorders>
+              <w:top w:val="single" w:sz="4" w:space="0" w:color="000000"/>
+              <w:left w:val="single" w:sz="4" w:space="0" w:color="000000"/>
+              <w:bottom w:val="single" w:sz="4" w:space="0" w:color="000000"/>
+              <w:right w:val="single" w:sz="4" w:space="0" w:color="000000"/>
+            </w:tcBorders>
+            <w:tcMar>
+              <w:top w:w="80" w:type="dxa"/>
+              <w:left w:w="100" w:type="dxa"/>
+              <w:bottom w:w="80" w:type="dxa"/>
+              <w:right w:w="100" w:type="dxa"/>
+            </w:tcMar>
+          </w:tcPr>
+          <w:p>
+            <w:pPr>
+              <w:spacing w:before="80" w:after="80"/>
+            </w:pPr>
+            <w:r>
+              <w:rPr>
+                <w:rFonts w:ascii="Calibri" w:hAnsi="Calibri"/>
+                <w:color w:val="000000"/>
+                <w:sz w:val="21"/>
+              </w:rPr>
+              <w:t>_________</w:t>
+            </w:r>
+          </w:p>
+        </w:tc>
+      </w:tr>
+      <w:tr>
+        <w:trPr>
+          <w:jc w:val="center"/>
+        </w:trPr>
+        <w:tc>
+          <w:tcPr>
+            <w:tcW w:w="5040" w:type="dxa"/>
+            <w:tcBorders>
+              <w:top w:val="single" w:sz="4" w:space="0" w:color="000000"/>
+              <w:left w:val="single" w:sz="4" w:space="0" w:color="000000"/>
+              <w:bottom w:val="single" w:sz="4" w:space="0" w:color="000000"/>
+              <w:right w:val="single" w:sz="4" w:space="0" w:color="000000"/>
+            </w:tcBorders>
+            <w:tcMar>
+              <w:top w:w="80" w:type="dxa"/>
+              <w:left w:w="100" w:type="dxa"/>
+              <w:bottom w:w="80" w:type="dxa"/>
+              <w:right w:w="100" w:type="dxa"/>
+            </w:tcMar>
+          </w:tcPr>
+          <w:p>
+            <w:pPr>
+              <w:spacing w:before="80" w:after="80"/>
+            </w:pPr>
+            <w:r>
+              <w:rPr>
+                <w:rFonts w:ascii="Calibri" w:hAnsi="Calibri"/>
+                <w:color w:val="000000"/>
+                <w:sz w:val="21"/>
+              </w:rPr>
+              <w:t>Viva &amp; Record (5 Marks):</w:t>
+            </w:r>
+          </w:p>
+        </w:tc>
+        <w:tc>
+          <w:tcPr>
+            <w:tcW w:w="4709" w:type="dxa"/>
+            <w:tcBorders>
+              <w:top w:val="single" w:sz="4" w:space="0" w:color="000000"/>
+              <w:left w:val="single" w:sz="4" w:space="0" w:color="000000"/>
+              <w:bottom w:val="single" w:sz="4" w:space="0" w:color="000000"/>
+              <w:right w:val="single" w:sz="4" w:space="0" w:color="000000"/>
+            </w:tcBorders>
+            <w:tcMar>
+              <w:top w:w="80" w:type="dxa"/>
+              <w:left w:w="100" w:type="dxa"/>
+              <w:bottom w:w="80" w:type="dxa"/>
+              <w:right w:w="100" w:type="dxa"/>
+            </w:tcMar>
+          </w:tcPr>
+          <w:p>
+            <w:pPr>
+              <w:spacing w:before="80" w:after="80"/>
+            </w:pPr>
+            <w:r>
+              <w:rPr>
+                <w:rFonts w:ascii="Calibri" w:hAnsi="Calibri"/>
+                <w:color w:val="000000"/>
+                <w:sz w:val="21"/>
+              </w:rPr>
+              <w:t>_________</w:t>
+            </w:r>
+          </w:p>
+        </w:tc>
+      </w:tr>
+      <w:tr>
+        <w:trPr>
+          <w:jc w:val="center"/>
+        </w:trPr>
+        <w:tc>
+          <w:tcPr>
+            <w:tcW w:w="5040" w:type="dxa"/>
+            <w:tcBorders>
+              <w:top w:val="single" w:sz="4" w:space="0" w:color="000000"/>
+              <w:left w:val="single" w:sz="4" w:space="0" w:color="000000"/>
+              <w:bottom w:val="single" w:sz="4" w:space="0" w:color="000000"/>
+              <w:right w:val="single" w:sz="4" w:space="0" w:color="000000"/>
+            </w:tcBorders>
+            <w:tcMar>
+              <w:top w:w="80" w:type="dxa"/>
+              <w:left w:w="100" w:type="dxa"/>
+              <w:bottom w:w="80" w:type="dxa"/>
+              <w:right w:w="100" w:type="dxa"/>
+            </w:tcMar>
+          </w:tcPr>
+          <w:p>
+            <w:pPr>
+              <w:spacing w:before="80" w:after="80"/>
+            </w:pPr>
+            <w:r>
+              <w:rPr>
+                <w:rFonts w:ascii="Calibri" w:hAnsi="Calibri"/>
+                <w:b/>
+                <w:color w:val="000000"/>
+                <w:sz w:val="21"/>
+              </w:rPr>
+              <w:t xml:space="preserve">TOTAL MARKS: [      / </w:t>
+            </w:r>
+            <w:proofErr w:type="gramStart"/>
+            <w:r>
+              <w:rPr>
+                <w:rFonts w:ascii="Calibri" w:hAnsi="Calibri"/>
+                <w:b/>
+                <w:color w:val="000000"/>
+                <w:sz w:val="21"/>
+              </w:rPr>
+              <w:t>15 ]</w:t>
+            </w:r>
+            <w:proofErr w:type="gramEnd"/>
+          </w:p>
+        </w:tc>
+        <w:tc>
+          <w:tcPr>
+            <w:tcW w:w="4709" w:type="dxa"/>
+            <w:tcBorders>
+              <w:top w:val="single" w:sz="4" w:space="0" w:color="000000"/>
+              <w:left w:val="single" w:sz="4" w:space="0" w:color="000000"/>
+              <w:bottom w:val="single" w:sz="4" w:space="0" w:color="000000"/>
+              <w:right w:val="single" w:sz="4" w:space="0" w:color="000000"/>
+            </w:tcBorders>
+            <w:tcMar>
+              <w:top w:w="80" w:type="dxa"/>
+              <w:left w:w="100" w:type="dxa"/>
+              <w:bottom w:w="80" w:type="dxa"/>
+              <w:right w:w="100" w:type="dxa"/>
+            </w:tcMar>
+          </w:tcPr>
+          <w:p>
+            <w:pPr>
+              <w:spacing w:before="80" w:after="80"/>
+            </w:pPr>
+            <w:r>
+              <w:rPr>
+                <w:rFonts w:ascii="Calibri" w:hAnsi="Calibri"/>
+                <w:b/>
+                <w:color w:val="000000"/>
+                <w:sz w:val="21"/>
+              </w:rPr>
+              <w:t>Faculty Signature: _______________________</w:t>
+            </w:r>
+          </w:p>
+        </w:tc>
+      </w:tr>
+    </w:tbl>
+    <w:p/>
     <w:sectPr>
-      <w:pgSz w:w="12240" w:h="15840"/>
-      <w:pgMar w:top="1440" w:right="1440" w:bottom="1440" w:left="1440" w:header="720" w:footer="720" w:gutter="0"/>
+      <w:pgSz w:w="11909" w:h="16834"/>
+      <w:pgMar w:top="1080" w:right="1080" w:bottom="1080" w:left="1080" w:header="720" w:footer="720" w:gutter="0"/>
       <w:cols w:space="720"/>
       <w:docGrid w:linePitch="360"/>
     </w:sectPr>
@@ -998,31 +2624,31 @@
       </w:rPr>
     </w:lvl>
   </w:abstractNum>
-  <w:num w:numId="1" w16cid:durableId="869688468">
+  <w:num w:numId="1" w16cid:durableId="252513077">
     <w:abstractNumId w:val="8"/>
   </w:num>
-  <w:num w:numId="2" w16cid:durableId="596868966">
+  <w:num w:numId="2" w16cid:durableId="372115312">
     <w:abstractNumId w:val="6"/>
   </w:num>
-  <w:num w:numId="3" w16cid:durableId="97604220">
+  <w:num w:numId="3" w16cid:durableId="2116055698">
     <w:abstractNumId w:val="5"/>
   </w:num>
-  <w:num w:numId="4" w16cid:durableId="1940796134">
+  <w:num w:numId="4" w16cid:durableId="549414320">
     <w:abstractNumId w:val="4"/>
   </w:num>
-  <w:num w:numId="5" w16cid:durableId="1326712221">
+  <w:num w:numId="5" w16cid:durableId="1897660980">
     <w:abstractNumId w:val="7"/>
   </w:num>
-  <w:num w:numId="6" w16cid:durableId="1731659520">
+  <w:num w:numId="6" w16cid:durableId="555357942">
     <w:abstractNumId w:val="3"/>
   </w:num>
-  <w:num w:numId="7" w16cid:durableId="1390883480">
+  <w:num w:numId="7" w16cid:durableId="1359357692">
     <w:abstractNumId w:val="2"/>
   </w:num>
-  <w:num w:numId="8" w16cid:durableId="1618753408">
+  <w:num w:numId="8" w16cid:durableId="1753160581">
     <w:abstractNumId w:val="1"/>
   </w:num>
-  <w:num w:numId="9" w16cid:durableId="385371136">
+  <w:num w:numId="9" w16cid:durableId="1138106719">
     <w:abstractNumId w:val="0"/>
   </w:num>
 </w:numbering>
@@ -1418,14 +3044,6 @@
     <w:name w:val="Normal"/>
     <w:qFormat/>
     <w:rsid w:val="00FC693F"/>
-    <w:pPr>
-      <w:spacing w:after="120"/>
-    </w:pPr>
-    <w:rPr>
-      <w:rFonts w:ascii="Times New Roman" w:hAnsi="Times New Roman"/>
-      <w:color w:val="000000"/>
-      <w:sz w:val="24"/>
-    </w:rPr>
   </w:style>
   <w:style w:type="paragraph" w:styleId="Heading1">
     <w:name w:val="heading 1"/>
@@ -1817,6 +3435,7 @@
       <w:iCs/>
       <w:color w:val="4F81BD" w:themeColor="accent1"/>
       <w:spacing w:val="15"/>
+      <w:sz w:val="24"/>
       <w:szCs w:val="24"/>
     </w:rPr>
   </w:style>
@@ -1854,6 +3473,9 @@
     <w:uiPriority w:val="99"/>
     <w:unhideWhenUsed/>
     <w:rsid w:val="00AA1D8D"/>
+    <w:pPr>
+      <w:spacing w:after="120"/>
+    </w:pPr>
   </w:style>
   <w:style w:type="character" w:customStyle="1" w:styleId="BodyTextChar">
     <w:name w:val="Body Text Char"/>
@@ -1870,7 +3492,7 @@
     <w:unhideWhenUsed/>
     <w:rsid w:val="00AA1D8D"/>
     <w:pPr>
-      <w:spacing w:line="480" w:lineRule="auto"/>
+      <w:spacing w:after="120" w:line="480" w:lineRule="auto"/>
     </w:pPr>
   </w:style>
   <w:style w:type="character" w:customStyle="1" w:styleId="BodyText2Char">
@@ -1887,6 +3509,9 @@
     <w:uiPriority w:val="99"/>
     <w:unhideWhenUsed/>
     <w:rsid w:val="00AA1D8D"/>
+    <w:pPr>
+      <w:spacing w:after="120"/>
+    </w:pPr>
     <w:rPr>
       <w:sz w:val="16"/>
       <w:szCs w:val="16"/>
@@ -2021,6 +3646,7 @@
     <w:unhideWhenUsed/>
     <w:rsid w:val="0029639D"/>
     <w:pPr>
+      <w:spacing w:after="120"/>
       <w:ind w:left="360"/>
       <w:contextualSpacing/>
     </w:pPr>
@@ -2032,6 +3658,7 @@
     <w:unhideWhenUsed/>
     <w:rsid w:val="0029639D"/>
     <w:pPr>
+      <w:spacing w:after="120"/>
       <w:ind w:left="720"/>
       <w:contextualSpacing/>
     </w:pPr>
@@ -2043,6 +3670,7 @@
     <w:unhideWhenUsed/>
     <w:rsid w:val="0029639D"/>
     <w:pPr>
+      <w:spacing w:after="120"/>
       <w:ind w:left="1080"/>
       <w:contextualSpacing/>
     </w:pPr>

</xml_diff>